<commit_message>
Added "Hello World" demo application code and description.
</commit_message>
<xml_diff>
--- a/Docs/WoW Thread Library.docx
+++ b/Docs/WoW Thread Library.docx
@@ -3657,251 +3657,119 @@
       <w:pPr>
         <w:pStyle w:val="Heading1"/>
       </w:pPr>
-      <w:bookmarkStart w:id="1" w:name="_Toc71057140"/>
-      <w:r>
-        <w:lastRenderedPageBreak/>
-        <w:t>About the Author</w:t>
-      </w:r>
-      <w:bookmarkEnd w:id="1"/>
-    </w:p>
-    <w:p>
-      <w:pPr>
-        <w:pStyle w:val="Technical"/>
-      </w:pPr>
-      <w:r>
-        <w:t>I began playing World of Warcraft shortly after its first release (Vanilla) and have leveled at least 1 character to max in every expansion since.</w:t>
-      </w:r>
-    </w:p>
-    <w:p>
-      <w:pPr>
-        <w:pStyle w:val="Technical"/>
-      </w:pPr>
-      <w:r>
-        <w:t>I hold a PhD in a field completely unrelated to programming</w:t>
-      </w:r>
-      <w:r>
-        <w:t xml:space="preserve">  </w:t>
-      </w:r>
-      <w:r>
-        <w:t>(immunology) and as such confers absolutely no credibility insofar as programming is concerned. On the other hand, I am a retired software architect with the following experience:</w:t>
-      </w:r>
-    </w:p>
-    <w:p>
-      <w:pPr>
-        <w:pStyle w:val="Technical"/>
-        <w:numPr>
-          <w:ilvl w:val="0"/>
-          <w:numId w:val="22"/>
-        </w:numPr>
-      </w:pPr>
-      <w:r>
-        <w:t>Architect and Lead developer of Digital Equipment Corporation’s distributed UNIX-based off-line storage facility (Backup/Restore, Disaster Recovery, etc.,)</w:t>
-      </w:r>
-    </w:p>
-    <w:p>
-      <w:pPr>
-        <w:pStyle w:val="Technical"/>
-        <w:numPr>
-          <w:ilvl w:val="0"/>
-          <w:numId w:val="22"/>
-        </w:numPr>
-      </w:pPr>
-      <w:r>
-        <w:t>Lead developer and architect for the disaster recovery facility</w:t>
-      </w:r>
-      <w:r>
-        <w:rPr>
-          <w:rStyle w:val="FootnoteReference"/>
-        </w:rPr>
-        <w:footnoteReference w:id="1"/>
-      </w:r>
-      <w:r>
-        <w:t xml:space="preserve"> in the Windows NT operating system kernel.</w:t>
-      </w:r>
-    </w:p>
-    <w:p>
-      <w:pPr>
-        <w:pStyle w:val="Technical"/>
-        <w:numPr>
-          <w:ilvl w:val="0"/>
-          <w:numId w:val="22"/>
-        </w:numPr>
-      </w:pPr>
-      <w:r>
-        <w:t>Wrote the first POSIX threads implementation for Linux</w:t>
-      </w:r>
-      <w:r>
-        <w:rPr>
-          <w:rStyle w:val="FootnoteReference"/>
-        </w:rPr>
-        <w:footnoteReference w:id="2"/>
-      </w:r>
-      <w:r>
-        <w:t>.</w:t>
-      </w:r>
-    </w:p>
-    <w:p>
-      <w:pPr>
-        <w:pStyle w:val="Technical"/>
-        <w:numPr>
-          <w:ilvl w:val="0"/>
-          <w:numId w:val="22"/>
-        </w:numPr>
-      </w:pPr>
-      <w:r>
-        <w:t xml:space="preserve">Author of </w:t>
-      </w:r>
-      <w:r>
-        <w:rPr>
-          <w:u w:val="single"/>
-        </w:rPr>
-        <w:t>DCE: A Guide To Developing Portable Applications</w:t>
-      </w:r>
-      <w:r>
-        <w:rPr>
-          <w:rStyle w:val="FootnoteReference"/>
-          <w:u w:val="single"/>
-        </w:rPr>
-        <w:footnoteReference w:id="3"/>
-      </w:r>
-      <w:r>
-        <w:t>. This book evolved, in part, from my association with the development of Digital’s Concert Multithread Architecture (CMA). CMA, and especially its lead developer, David Butenof. David was a formative influence on the development of POSIX threads</w:t>
-      </w:r>
-      <w:r>
-        <w:rPr>
-          <w:rStyle w:val="FootnoteReference"/>
-        </w:rPr>
-        <w:footnoteReference w:id="4"/>
-      </w:r>
-      <w:r>
-        <w:t>.</w:t>
-      </w:r>
-    </w:p>
-    <w:p>
-      <w:pPr>
-        <w:pStyle w:val="Technical"/>
-      </w:pPr>
-      <w:r>
-        <w:t>As inferred earlier, one of the reasons I wrote a threads library for WoW addon development arises from what I believe is a good deal of confusion about threads – what they are and their good, bad, and ugly aspects. So, let’s dive into these muddy waters and see if we can get a clearer understanding along with some perspective as to how multithreading a WoW addon might be just the thing your addon needs, but probably isn’t.</w:t>
-      </w:r>
-    </w:p>
-    <w:p>
-      <w:pPr>
-        <w:pStyle w:val="Heading1"/>
-      </w:pPr>
-      <w:bookmarkStart w:id="2" w:name="_Toc71057141"/>
+      <w:bookmarkStart w:id="1" w:name="_Toc71057141"/>
       <w:r>
         <w:lastRenderedPageBreak/>
         <w:t>Introduction</w:t>
       </w:r>
+      <w:bookmarkEnd w:id="1"/>
+    </w:p>
+    <w:p>
+      <w:pPr>
+        <w:pStyle w:val="Technical"/>
+      </w:pPr>
+      <w:r>
+        <w:t>Every so often a post will appear on one of the WoW Forums suggesting th</w:t>
+      </w:r>
+      <w:r>
+        <w:t>at</w:t>
+      </w:r>
+      <w:r>
+        <w:t xml:space="preserve"> Blizzard would be better off if the</w:t>
+      </w:r>
+      <w:r>
+        <w:t>ir</w:t>
+      </w:r>
+      <w:r>
+        <w:t xml:space="preserve"> program development philosophy would just get with the times and</w:t>
+      </w:r>
+      <w:r>
+        <w:t xml:space="preserve"> redesign </w:t>
+      </w:r>
+      <w:r>
+        <w:t>the WoW client</w:t>
+      </w:r>
+      <w:r>
+        <w:t xml:space="preserve"> to support multithreading.</w:t>
+      </w:r>
+    </w:p>
+    <w:p>
+      <w:pPr>
+        <w:pStyle w:val="Technical"/>
+      </w:pPr>
+      <w:r>
+        <w:t xml:space="preserve">This would not be wise for all kinds of reasons, but what strikes me </w:t>
+      </w:r>
+      <w:r>
+        <w:t xml:space="preserve">as fascinating is </w:t>
+      </w:r>
+      <w:r>
+        <w:t xml:space="preserve">is the misconceptions </w:t>
+      </w:r>
+      <w:r>
+        <w:t>of many of the thread proponents</w:t>
+      </w:r>
+      <w:r>
+        <w:t xml:space="preserve"> have about threads and </w:t>
+      </w:r>
+      <w:r>
+        <w:t>how best they can/should be used</w:t>
+      </w:r>
+      <w:r>
+        <w:t>.</w:t>
+      </w:r>
+      <w:r>
+        <w:t xml:space="preserve"> Perhaps the most profound misconception is that the value of multithreading an application resides in the performance improvement gained by parallel execution of the application’s threads. Nothing could be further from the truth</w:t>
+      </w:r>
+      <w:r>
+        <w:t xml:space="preserve"> (see the two articles at the end of this document under </w:t>
+      </w:r>
+      <w:r>
+        <w:fldChar w:fldCharType="begin"/>
+      </w:r>
+      <w:r>
+        <w:instrText xml:space="preserve"> REF _Ref70946386 \h </w:instrText>
+      </w:r>
+      <w:r>
+        <w:fldChar w:fldCharType="separate"/>
+      </w:r>
+      <w:r>
+        <w:t>Threads In Perspective</w:t>
+      </w:r>
+      <w:r>
+        <w:fldChar w:fldCharType="end"/>
+      </w:r>
+      <w:r>
+        <w:t xml:space="preserve">. </w:t>
+      </w:r>
+      <w:r>
+        <w:t xml:space="preserve">Actually, multithreading for parallel execution is not that common except on high end systems not infrequently built with special hardware. </w:t>
+      </w:r>
+      <w:r>
+        <w:t xml:space="preserve">It turns out that arguably </w:t>
+      </w:r>
+      <w:r>
+        <w:t>t</w:t>
+      </w:r>
+      <w:r>
+        <w:t>he most common use of multithreading is</w:t>
+      </w:r>
+      <w:r>
+        <w:t xml:space="preserve"> for event- and task-oriented applications</w:t>
+      </w:r>
+      <w:r>
+        <w:t>.</w:t>
+      </w:r>
+    </w:p>
+    <w:p>
+      <w:pPr>
+        <w:pStyle w:val="Heading2"/>
+      </w:pPr>
+      <w:bookmarkStart w:id="2" w:name="_Toc71057142"/>
+      <w:r>
+        <w:t>Asynchronous and Synchronous Execution Models</w:t>
+      </w:r>
       <w:bookmarkEnd w:id="2"/>
-    </w:p>
-    <w:p>
-      <w:pPr>
-        <w:pStyle w:val="Technical"/>
-      </w:pPr>
-      <w:r>
-        <w:t>Every so often a post will appear on one of the WoW Forums suggesting th</w:t>
-      </w:r>
-      <w:r>
-        <w:t>at</w:t>
-      </w:r>
-      <w:r>
-        <w:t xml:space="preserve"> Blizzard would be better off if the</w:t>
-      </w:r>
-      <w:r>
-        <w:t>ir</w:t>
-      </w:r>
-      <w:r>
-        <w:t xml:space="preserve"> program development philosophy would just get with the times and</w:t>
-      </w:r>
-      <w:r>
-        <w:t xml:space="preserve"> redesign </w:t>
-      </w:r>
-      <w:r>
-        <w:t>the WoW client</w:t>
-      </w:r>
-      <w:r>
-        <w:t xml:space="preserve"> to support multithreading.</w:t>
-      </w:r>
-    </w:p>
-    <w:p>
-      <w:pPr>
-        <w:pStyle w:val="Technical"/>
-      </w:pPr>
-      <w:r>
-        <w:t xml:space="preserve">This would not be wise for all kinds of reasons, but what strikes me </w:t>
-      </w:r>
-      <w:r>
-        <w:t xml:space="preserve">as fascinating is </w:t>
-      </w:r>
-      <w:r>
-        <w:t xml:space="preserve">is the misconceptions </w:t>
-      </w:r>
-      <w:r>
-        <w:t>of many of the thread proponents</w:t>
-      </w:r>
-      <w:r>
-        <w:t xml:space="preserve"> have about threads and </w:t>
-      </w:r>
-      <w:r>
-        <w:t>how best they can/should be used</w:t>
-      </w:r>
-      <w:r>
-        <w:t>.</w:t>
-      </w:r>
-      <w:r>
-        <w:t xml:space="preserve"> Perhaps the most profound misconception is that the value of multithreading an application resides in the performance improvement gained by parallel execution of the application’s threads. Nothing could be further from the truth</w:t>
-      </w:r>
-      <w:r>
-        <w:t xml:space="preserve"> (see the two articles at the end of this document under </w:t>
-      </w:r>
-      <w:r>
-        <w:fldChar w:fldCharType="begin"/>
-      </w:r>
-      <w:r>
-        <w:instrText xml:space="preserve"> REF _Ref70946386 \h </w:instrText>
-      </w:r>
-      <w:r>
-        <w:fldChar w:fldCharType="separate"/>
-      </w:r>
-      <w:r>
-        <w:t>Threads In Perspective</w:t>
-      </w:r>
-      <w:r>
-        <w:fldChar w:fldCharType="end"/>
-      </w:r>
-      <w:r>
-        <w:t xml:space="preserve">. </w:t>
-      </w:r>
-      <w:r>
-        <w:t xml:space="preserve">Actually, multithreading for parallel execution is not that common except on high end systems not infrequently built with special hardware. </w:t>
-      </w:r>
-      <w:r>
-        <w:t xml:space="preserve">It turns out that arguably </w:t>
-      </w:r>
-      <w:r>
-        <w:t>t</w:t>
-      </w:r>
-      <w:r>
-        <w:t>he most common use of multithreading is</w:t>
-      </w:r>
-      <w:r>
-        <w:t xml:space="preserve"> for event- and task-oriented applications</w:t>
-      </w:r>
-      <w:r>
-        <w:t>.</w:t>
-      </w:r>
-    </w:p>
-    <w:p>
-      <w:pPr>
-        <w:pStyle w:val="Heading2"/>
-      </w:pPr>
-      <w:bookmarkStart w:id="3" w:name="_Toc71057142"/>
-      <w:r>
-        <w:t>Asynchronous and Synchronous Execution Models</w:t>
-      </w:r>
-      <w:bookmarkEnd w:id="3"/>
     </w:p>
     <w:p>
       <w:pPr>
@@ -4007,10 +3875,7 @@
       </w:pPr>
       <w:r>
         <w:lastRenderedPageBreak/>
-        <w:t>Immediately after the chef starts the eggs cooking, s/he turns to other kitchen tasks like washing dishes. When the eggs are almost done, s/he starts the toast so that it completes when the eggs are done. S/he then serves the customer hot toast and hot eggs. Most of us work this way naturally.</w:t>
-      </w:r>
-      <w:r>
-        <w:t xml:space="preserve"> It just makes sense to turn to some other task while waiting for a</w:t>
+        <w:t>Immediately after the chef starts the eggs cooking, s/he turns to other kitchen tasks like washing dishes. When the eggs are almost done, s/he starts the toast so that it completes when the eggs are done. S/he then serves the customer hot toast and hot eggs. Most of us work this way naturally. It just makes sense to turn to some other task while waiting for a</w:t>
       </w:r>
       <w:r>
         <w:t>n in-progress</w:t>
@@ -4095,19 +3960,7 @@
         <w:t xml:space="preserve">  </w:t>
       </w:r>
       <w:r>
-        <w:t xml:space="preserve">chef hires two </w:t>
-      </w:r>
-      <w:r>
-        <w:t xml:space="preserve">additional </w:t>
-      </w:r>
-      <w:r>
-        <w:t xml:space="preserve">cooks; an egg cook and a toast cook. The chef then coordinates the two cooks such that the eggs and toast finish at the same time. As in the </w:t>
-      </w:r>
-      <w:r>
-        <w:t xml:space="preserve">Type I </w:t>
-      </w:r>
-      <w:r>
-        <w:t xml:space="preserve">model, the customer gets hot eggs and toast. </w:t>
+        <w:t xml:space="preserve">chef hires two additional cooks; an egg cook and a toast cook. The chef then coordinates the two cooks such that the eggs and toast finish at the same time. As in the Type I model, the customer gets hot eggs and toast. </w:t>
       </w:r>
     </w:p>
     <w:p>
@@ -4129,13 +3982,7 @@
         <w:pStyle w:val="Technical"/>
       </w:pPr>
       <w:r>
-        <w:t>In this analogy, the asynchronous</w:t>
-      </w:r>
-      <w:r>
-        <w:t xml:space="preserve"> Type II </w:t>
-      </w:r>
-      <w:r>
-        <w:t xml:space="preserve">model might be thought of as </w:t>
+        <w:t xml:space="preserve">In this analogy, the asynchronous Type II model might be thought of as </w:t>
       </w:r>
       <w:r>
         <w:rPr>
@@ -4145,10 +3992,7 @@
         <w:t>employee-oriented</w:t>
       </w:r>
       <w:r>
-        <w:t>, while the Type I</w:t>
-      </w:r>
-      <w:r>
-        <w:t xml:space="preserve"> model is better thought of as </w:t>
+        <w:t xml:space="preserve">, while the Type I model is better thought of as </w:t>
       </w:r>
       <w:r>
         <w:rPr>
@@ -4158,49 +4002,7 @@
         <w:t>task-oriented</w:t>
       </w:r>
       <w:r>
-        <w:t xml:space="preserve">. </w:t>
-      </w:r>
-      <w:r>
-        <w:t>The key here is that both models are asynchronous, b</w:t>
-      </w:r>
-      <w:r>
-        <w:t>oth are useful</w:t>
-      </w:r>
-      <w:r>
-        <w:t>,</w:t>
-      </w:r>
-      <w:r>
-        <w:t xml:space="preserve"> and </w:t>
-      </w:r>
-      <w:r>
-        <w:t xml:space="preserve">both </w:t>
-      </w:r>
-      <w:r>
-        <w:t>have their place</w:t>
-      </w:r>
-      <w:r>
-        <w:t>s</w:t>
-      </w:r>
-      <w:r>
-        <w:t>.</w:t>
-      </w:r>
-      <w:r>
-        <w:t xml:space="preserve"> In terms of software applications, the Type II model </w:t>
-      </w:r>
-      <w:r>
-        <w:t>is unbeatable for large-scale, high-end, compute intensive applications that</w:t>
-      </w:r>
-      <w:r>
-        <w:t>, and this is key,</w:t>
-      </w:r>
-      <w:r>
-        <w:t xml:space="preserve"> can be structured to run </w:t>
-      </w:r>
-      <w:r>
-        <w:t>multiple threads</w:t>
-      </w:r>
-      <w:r>
-        <w:t xml:space="preserve"> simultaneously and independently on separate processors</w:t>
+        <w:t>. The key here is that both models are asynchronous, both are useful, and both have their places. In terms of software applications, the Type II model is unbeatable for large-scale, high-end, compute intensive applications that, and this is key, can be structured to run multiple threads simultaneously and independently on separate processors</w:t>
       </w:r>
       <w:r>
         <w:t xml:space="preserve"> – or, per the analogy, giving each of the cooks their own kitchen</w:t>
@@ -4314,7 +4116,7 @@
         <w:rPr>
           <w:rStyle w:val="FootnoteReference"/>
         </w:rPr>
-        <w:footnoteReference w:id="5"/>
+        <w:footnoteReference w:id="1"/>
       </w:r>
       <w:r>
         <w:t xml:space="preserve"> employ asynchronous,</w:t>
@@ -4330,11 +4132,11 @@
       <w:pPr>
         <w:pStyle w:val="Heading2"/>
       </w:pPr>
-      <w:bookmarkStart w:id="4" w:name="_Toc71057143"/>
+      <w:bookmarkStart w:id="3" w:name="_Toc71057143"/>
       <w:r>
         <w:t>Multithreading – Preemptive and Non-preemptive threads</w:t>
       </w:r>
-      <w:bookmarkEnd w:id="4"/>
+      <w:bookmarkEnd w:id="3"/>
     </w:p>
     <w:p>
       <w:pPr>
@@ -4350,19 +4152,7 @@
         <w:t>can be confusing</w:t>
       </w:r>
       <w:r>
-        <w:t xml:space="preserve"> so I'd like first to clarify not only what threads are, but what they are best used for. To begin, a thread is nothing more than a data structure (</w:t>
-      </w:r>
-      <w:r>
-        <w:t>a</w:t>
-      </w:r>
-      <w:r>
-        <w:t xml:space="preserve"> table in Lua) containing as one of its elements a </w:t>
-      </w:r>
-      <w:r>
-        <w:t xml:space="preserve">single </w:t>
-      </w:r>
-      <w:r>
-        <w:t xml:space="preserve">procedure call. Nominally, </w:t>
+        <w:t xml:space="preserve"> so I'd like first to clarify not only what threads are, but what they are best used for. To begin, a thread is nothing more than a data structure (a table in Lua) containing as one of its elements a single procedure call. Nominally, </w:t>
       </w:r>
       <w:r>
         <w:t>a thread</w:t>
@@ -4486,14 +4276,14 @@
           <w:lang w:bidi="he-IL"/>
         </w:rPr>
       </w:pPr>
-      <w:bookmarkStart w:id="5" w:name="_Toc71057144"/>
+      <w:bookmarkStart w:id="4" w:name="_Toc71057144"/>
       <w:r>
         <w:rPr>
           <w:lang w:bidi="he-IL"/>
         </w:rPr>
         <w:t>Preemptive Threads</w:t>
       </w:r>
-      <w:bookmarkEnd w:id="5"/>
+      <w:bookmarkEnd w:id="4"/>
     </w:p>
     <w:p>
       <w:pPr>
@@ -4506,7 +4296,7 @@
         <w:rPr>
           <w:rStyle w:val="FootnoteReference"/>
         </w:rPr>
-        <w:footnoteReference w:id="6"/>
+        <w:footnoteReference w:id="2"/>
       </w:r>
       <w:r>
         <w:t xml:space="preserve"> and is very resource intensive. So unless the cost of a thread context switch can be offset by an increase i</w:t>
@@ -4521,19 +4311,13 @@
         <w:t>Why? Because t</w:t>
       </w:r>
       <w:r>
-        <w:t>he</w:t>
-      </w:r>
-      <w:r>
-        <w:t xml:space="preserve"> difficulties involved in managing preemptive threads are legion and arise from the observation that a thread can be preempted</w:t>
+        <w:t>he difficulties involved in managing preemptive threads are legion and arise from the observation that a thread can be preempted</w:t>
       </w:r>
       <w:r>
         <w:t xml:space="preserve"> </w:t>
       </w:r>
       <w:r>
-        <w:t xml:space="preserve">at any point in its execution stream. </w:t>
-      </w:r>
-      <w:r>
-        <w:t>This means that if the operating system decides to switch to another thread while the current thread is updating your bank account, you could be left broke.</w:t>
+        <w:t>at any point in its execution stream. This means that if the operating system decides to switch to another thread while the current thread is updating your bank account, you could be left broke.</w:t>
       </w:r>
       <w:r>
         <w:t xml:space="preserve">  </w:t>
@@ -4650,65 +4434,65 @@
       <w:pPr>
         <w:pStyle w:val="Heading3"/>
       </w:pPr>
-      <w:bookmarkStart w:id="6" w:name="_Toc71057145"/>
+      <w:bookmarkStart w:id="5" w:name="_Toc71057145"/>
       <w:r>
         <w:t>Non-preemptive threads</w:t>
       </w:r>
+      <w:bookmarkEnd w:id="5"/>
+    </w:p>
+    <w:p>
+      <w:pPr>
+        <w:pStyle w:val="Technical"/>
+      </w:pPr>
+      <w:r>
+        <w:t>In</w:t>
+      </w:r>
+      <w:r>
+        <w:t xml:space="preserve"> </w:t>
+      </w:r>
+      <w:r>
+        <w:t xml:space="preserve">the non-preemptive </w:t>
+      </w:r>
+      <w:r>
+        <w:t xml:space="preserve">model </w:t>
+      </w:r>
+      <w:r>
+        <w:t>a thread executes until it yields the processor to another thread or terminates.</w:t>
+      </w:r>
+      <w:r>
+        <w:t xml:space="preserve"> In either case, the scheduler then </w:t>
+      </w:r>
+      <w:r>
+        <w:t>submits</w:t>
+      </w:r>
+      <w:r>
+        <w:t xml:space="preserve"> the next</w:t>
+      </w:r>
+      <w:r>
+        <w:t xml:space="preserve"> </w:t>
+      </w:r>
+      <w:r>
+        <w:t xml:space="preserve">thread </w:t>
+      </w:r>
+      <w:r>
+        <w:t xml:space="preserve">eligible </w:t>
+      </w:r>
+      <w:r>
+        <w:t>for execution to the run queue.</w:t>
+      </w:r>
+      <w:r>
+        <w:t xml:space="preserve"> </w:t>
+      </w:r>
+    </w:p>
+    <w:p>
+      <w:pPr>
+        <w:pStyle w:val="Heading3"/>
+      </w:pPr>
+      <w:bookmarkStart w:id="6" w:name="_Toc71057146"/>
+      <w:r>
+        <w:t>Concurrency</w:t>
+      </w:r>
       <w:bookmarkEnd w:id="6"/>
-    </w:p>
-    <w:p>
-      <w:pPr>
-        <w:pStyle w:val="Technical"/>
-      </w:pPr>
-      <w:r>
-        <w:t>In</w:t>
-      </w:r>
-      <w:r>
-        <w:t xml:space="preserve"> </w:t>
-      </w:r>
-      <w:r>
-        <w:t xml:space="preserve">the non-preemptive </w:t>
-      </w:r>
-      <w:r>
-        <w:t xml:space="preserve">model </w:t>
-      </w:r>
-      <w:r>
-        <w:t>a thread executes until it yields the processor to another thread or terminates.</w:t>
-      </w:r>
-      <w:r>
-        <w:t xml:space="preserve"> In either case, the scheduler then </w:t>
-      </w:r>
-      <w:r>
-        <w:t>submits</w:t>
-      </w:r>
-      <w:r>
-        <w:t xml:space="preserve"> the next</w:t>
-      </w:r>
-      <w:r>
-        <w:t xml:space="preserve"> </w:t>
-      </w:r>
-      <w:r>
-        <w:t xml:space="preserve">thread </w:t>
-      </w:r>
-      <w:r>
-        <w:t xml:space="preserve">eligible </w:t>
-      </w:r>
-      <w:r>
-        <w:t>for execution to the run queue.</w:t>
-      </w:r>
-      <w:r>
-        <w:t xml:space="preserve"> </w:t>
-      </w:r>
-    </w:p>
-    <w:p>
-      <w:pPr>
-        <w:pStyle w:val="Heading3"/>
-      </w:pPr>
-      <w:bookmarkStart w:id="7" w:name="_Toc71057146"/>
-      <w:r>
-        <w:t>Concurrency</w:t>
-      </w:r>
-      <w:bookmarkEnd w:id="7"/>
     </w:p>
     <w:p>
       <w:pPr>
@@ -4832,7 +4616,7 @@
       <w:pPr>
         <w:pStyle w:val="Heading1"/>
       </w:pPr>
-      <w:bookmarkStart w:id="8" w:name="_Toc71057147"/>
+      <w:bookmarkStart w:id="7" w:name="_Toc71057147"/>
       <w:r>
         <w:t xml:space="preserve">The WoW </w:t>
       </w:r>
@@ -4845,53 +4629,53 @@
       <w:r>
         <w:t xml:space="preserve"> Library API</w:t>
       </w:r>
+      <w:bookmarkEnd w:id="7"/>
+    </w:p>
+    <w:p>
+      <w:pPr>
+        <w:pStyle w:val="Technical"/>
+      </w:pPr>
+      <w:r>
+        <w:t>The WoW Multithread Library (code name, Talon) is a collection of services that enable WoW addon developers to incorporate multiple, asynchronous, non-preemptive threads in</w:t>
+      </w:r>
+      <w:r>
+        <w:t>to</w:t>
+      </w:r>
+      <w:r>
+        <w:t xml:space="preserve"> their addon. Talon threads can increase and addon’s concurrency, </w:t>
+      </w:r>
+      <w:r>
+        <w:t>reduce coding complexity</w:t>
+      </w:r>
+      <w:r>
+        <w:rPr>
+          <w:rStyle w:val="FootnoteReference"/>
+        </w:rPr>
+        <w:footnoteReference w:id="3"/>
+      </w:r>
+      <w:r>
+        <w:t xml:space="preserve"> making debugging and suppport easier.</w:t>
+      </w:r>
+    </w:p>
+    <w:p>
+      <w:pPr>
+        <w:pStyle w:val="Heading2"/>
+      </w:pPr>
+      <w:bookmarkStart w:id="8" w:name="_Toc71057148"/>
+      <w:r>
+        <w:t>Design Considerations</w:t>
+      </w:r>
       <w:bookmarkEnd w:id="8"/>
     </w:p>
     <w:p>
       <w:pPr>
-        <w:pStyle w:val="Technical"/>
-      </w:pPr>
-      <w:r>
-        <w:t>The WoW Multithread Library (code name, Talon) is a collection of services that enable WoW addon developers to incorporate multiple, asynchronous, non-preemptive threads in</w:t>
-      </w:r>
-      <w:r>
-        <w:t>to</w:t>
-      </w:r>
-      <w:r>
-        <w:t xml:space="preserve"> their addon. Talon threads can increase and addon’s concurrency, </w:t>
-      </w:r>
-      <w:r>
-        <w:t>reduce coding complexity</w:t>
-      </w:r>
-      <w:r>
-        <w:rPr>
-          <w:rStyle w:val="FootnoteReference"/>
-        </w:rPr>
-        <w:footnoteReference w:id="7"/>
-      </w:r>
-      <w:r>
-        <w:t xml:space="preserve"> making debugging and suppport easier.</w:t>
-      </w:r>
-    </w:p>
-    <w:p>
-      <w:pPr>
-        <w:pStyle w:val="Heading2"/>
-      </w:pPr>
-      <w:bookmarkStart w:id="9" w:name="_Toc71057148"/>
-      <w:r>
-        <w:t>Design Considerations</w:t>
+        <w:pStyle w:val="Heading3"/>
+      </w:pPr>
+      <w:bookmarkStart w:id="9" w:name="_Toc71057149"/>
+      <w:r>
+        <w:t>Patterns</w:t>
       </w:r>
       <w:bookmarkEnd w:id="9"/>
-    </w:p>
-    <w:p>
-      <w:pPr>
-        <w:pStyle w:val="Heading3"/>
-      </w:pPr>
-      <w:bookmarkStart w:id="10" w:name="_Toc71057149"/>
-      <w:r>
-        <w:t>Patterns</w:t>
-      </w:r>
-      <w:bookmarkEnd w:id="10"/>
     </w:p>
     <w:p>
       <w:pPr>
@@ -5407,11 +5191,11 @@
       <w:pPr>
         <w:pStyle w:val="Heading3"/>
       </w:pPr>
-      <w:bookmarkStart w:id="11" w:name="_Toc71057150"/>
+      <w:bookmarkStart w:id="10" w:name="_Toc71057150"/>
       <w:r>
         <w:t>Code Structure</w:t>
       </w:r>
-      <w:bookmarkEnd w:id="11"/>
+      <w:bookmarkEnd w:id="10"/>
     </w:p>
     <w:p>
       <w:pPr>
@@ -5537,7 +5321,7 @@
         <w:rPr>
           <w:rStyle w:val="FootnoteReference"/>
         </w:rPr>
-        <w:footnoteReference w:id="8"/>
+        <w:footnoteReference w:id="4"/>
       </w:r>
       <w:r>
         <w:t xml:space="preserve"> like so:</w:t>
@@ -5742,12 +5526,12 @@
       <w:pPr>
         <w:pStyle w:val="Heading2"/>
       </w:pPr>
-      <w:bookmarkStart w:id="12" w:name="_Toc71057151"/>
+      <w:bookmarkStart w:id="11" w:name="_Toc71057151"/>
       <w:r>
         <w:lastRenderedPageBreak/>
         <w:t>Startup</w:t>
       </w:r>
-      <w:bookmarkEnd w:id="12"/>
+      <w:bookmarkEnd w:id="11"/>
     </w:p>
     <w:p>
       <w:pPr>
@@ -5957,11 +5741,11 @@
       <w:pPr>
         <w:pStyle w:val="Heading2"/>
       </w:pPr>
-      <w:bookmarkStart w:id="13" w:name="_Toc71057152"/>
+      <w:bookmarkStart w:id="12" w:name="_Toc71057152"/>
       <w:r>
         <w:t>Thread</w:t>
       </w:r>
-      <w:bookmarkEnd w:id="13"/>
+      <w:bookmarkEnd w:id="12"/>
       <w:r>
         <w:t>s</w:t>
       </w:r>
@@ -6186,11 +5970,11 @@
       <w:pPr>
         <w:pStyle w:val="Heading3"/>
       </w:pPr>
-      <w:bookmarkStart w:id="14" w:name="_Toc71057153"/>
+      <w:bookmarkStart w:id="13" w:name="_Toc71057153"/>
       <w:r>
         <w:t>The Thread Handle</w:t>
       </w:r>
-      <w:bookmarkEnd w:id="14"/>
+      <w:bookmarkEnd w:id="13"/>
     </w:p>
     <w:p>
       <w:pPr>
@@ -6802,56 +6586,56 @@
       <w:pPr>
         <w:pStyle w:val="Heading3"/>
       </w:pPr>
-      <w:bookmarkStart w:id="15" w:name="_Toc71057154"/>
+      <w:bookmarkStart w:id="14" w:name="_Toc71057154"/>
       <w:r>
         <w:t>Thread Creation</w:t>
       </w:r>
+      <w:bookmarkEnd w:id="14"/>
+    </w:p>
+    <w:p>
+      <w:pPr>
+        <w:pStyle w:val="Technical"/>
+      </w:pPr>
+      <w:r>
+        <w:t xml:space="preserve">When </w:t>
+      </w:r>
+      <w:r>
+        <w:t xml:space="preserve">a thread is created its </w:t>
+      </w:r>
+      <w:r>
+        <w:t>state variables</w:t>
+      </w:r>
+      <w:r>
+        <w:t xml:space="preserve"> (used by the dispatcher to control its execution)</w:t>
+      </w:r>
+      <w:r>
+        <w:t xml:space="preserve"> are stored in </w:t>
+      </w:r>
+      <w:r>
+        <w:t>the thread</w:t>
+      </w:r>
+      <w:r>
+        <w:t xml:space="preserve"> handle</w:t>
+      </w:r>
+      <w:r>
+        <w:t>.</w:t>
+      </w:r>
+      <w:r>
+        <w:t xml:space="preserve"> </w:t>
+      </w:r>
+      <w:r>
+        <w:t xml:space="preserve">Upon successful completion the handle is returned to the caller. </w:t>
+      </w:r>
+    </w:p>
+    <w:p>
+      <w:pPr>
+        <w:pStyle w:val="Heading3"/>
+      </w:pPr>
+      <w:bookmarkStart w:id="15" w:name="_Toc71057155"/>
+      <w:r>
+        <w:t>The Thread Control Block (aka Dispatch Table)</w:t>
+      </w:r>
       <w:bookmarkEnd w:id="15"/>
-    </w:p>
-    <w:p>
-      <w:pPr>
-        <w:pStyle w:val="Technical"/>
-      </w:pPr>
-      <w:r>
-        <w:t xml:space="preserve">When </w:t>
-      </w:r>
-      <w:r>
-        <w:t xml:space="preserve">a thread is created its </w:t>
-      </w:r>
-      <w:r>
-        <w:t>state variables</w:t>
-      </w:r>
-      <w:r>
-        <w:t xml:space="preserve"> (used by the dispatcher to control its execution)</w:t>
-      </w:r>
-      <w:r>
-        <w:t xml:space="preserve"> are stored in </w:t>
-      </w:r>
-      <w:r>
-        <w:t>the thread</w:t>
-      </w:r>
-      <w:r>
-        <w:t xml:space="preserve"> handle</w:t>
-      </w:r>
-      <w:r>
-        <w:t>.</w:t>
-      </w:r>
-      <w:r>
-        <w:t xml:space="preserve"> </w:t>
-      </w:r>
-      <w:r>
-        <w:t xml:space="preserve">Upon successful completion the handle is returned to the caller. </w:t>
-      </w:r>
-    </w:p>
-    <w:p>
-      <w:pPr>
-        <w:pStyle w:val="Heading3"/>
-      </w:pPr>
-      <w:bookmarkStart w:id="16" w:name="_Toc71057155"/>
-      <w:r>
-        <w:t>The Thread Control Block (aka Dispatch Table)</w:t>
-      </w:r>
-      <w:bookmarkEnd w:id="16"/>
     </w:p>
     <w:p>
       <w:pPr>
@@ -7001,7 +6785,7 @@
         <w:rPr>
           <w:rStyle w:val="FootnoteReference"/>
         </w:rPr>
-        <w:footnoteReference w:id="9"/>
+        <w:footnoteReference w:id="5"/>
       </w:r>
       <w:r>
         <w:t>.). During this interval the dispatcher examines the state of each thread in its TCB an</w:t>
@@ -7082,7 +6866,7 @@
       <w:pPr>
         <w:pStyle w:val="Heading2"/>
       </w:pPr>
-      <w:bookmarkStart w:id="17" w:name="_Toc71057156"/>
+      <w:bookmarkStart w:id="16" w:name="_Toc71057156"/>
       <w:r>
         <w:t xml:space="preserve">Signaling – </w:t>
       </w:r>
@@ -7098,55 +6882,55 @@
       <w:r>
         <w:t xml:space="preserve"> Communication</w:t>
       </w:r>
+      <w:bookmarkEnd w:id="16"/>
+    </w:p>
+    <w:p>
+      <w:pPr>
+        <w:pStyle w:val="Technical"/>
+      </w:pPr>
+      <w:r>
+        <w:t>In</w:t>
+      </w:r>
+      <w:r>
+        <w:t xml:space="preserve"> Talon</w:t>
+      </w:r>
+      <w:r>
+        <w:t>,</w:t>
+      </w:r>
+      <w:r>
+        <w:t xml:space="preserve"> s</w:t>
+      </w:r>
+      <w:r>
+        <w:t xml:space="preserve">ignals are </w:t>
+      </w:r>
+      <w:r>
+        <w:t xml:space="preserve">integer values used to </w:t>
+      </w:r>
+      <w:r>
+        <w:t>communicate between</w:t>
+      </w:r>
+      <w:r>
+        <w:t xml:space="preserve"> threads</w:t>
+      </w:r>
+      <w:r>
+        <w:rPr>
+          <w:rStyle w:val="EndnoteReference"/>
+        </w:rPr>
+        <w:endnoteReference w:id="1"/>
+      </w:r>
+      <w:r>
+        <w:t>.</w:t>
+      </w:r>
+    </w:p>
+    <w:p>
+      <w:pPr>
+        <w:pStyle w:val="Heading3"/>
+      </w:pPr>
+      <w:bookmarkStart w:id="17" w:name="_Toc71057157"/>
+      <w:r>
+        <w:t>Signals</w:t>
+      </w:r>
       <w:bookmarkEnd w:id="17"/>
-    </w:p>
-    <w:p>
-      <w:pPr>
-        <w:pStyle w:val="Technical"/>
-      </w:pPr>
-      <w:r>
-        <w:t>In</w:t>
-      </w:r>
-      <w:r>
-        <w:t xml:space="preserve"> Talon</w:t>
-      </w:r>
-      <w:r>
-        <w:t>,</w:t>
-      </w:r>
-      <w:r>
-        <w:t xml:space="preserve"> s</w:t>
-      </w:r>
-      <w:r>
-        <w:t xml:space="preserve">ignals are </w:t>
-      </w:r>
-      <w:r>
-        <w:t xml:space="preserve">integer values used to </w:t>
-      </w:r>
-      <w:r>
-        <w:t>communicate between</w:t>
-      </w:r>
-      <w:r>
-        <w:t xml:space="preserve"> threads</w:t>
-      </w:r>
-      <w:r>
-        <w:rPr>
-          <w:rStyle w:val="EndnoteReference"/>
-        </w:rPr>
-        <w:endnoteReference w:id="1"/>
-      </w:r>
-      <w:r>
-        <w:t>.</w:t>
-      </w:r>
-    </w:p>
-    <w:p>
-      <w:pPr>
-        <w:pStyle w:val="Heading3"/>
-      </w:pPr>
-      <w:bookmarkStart w:id="18" w:name="_Toc71057157"/>
-      <w:r>
-        <w:t>Signals</w:t>
-      </w:r>
-      <w:bookmarkEnd w:id="18"/>
     </w:p>
     <w:p>
       <w:pPr>
@@ -7291,7 +7075,7 @@
               <w:rPr>
                 <w:rStyle w:val="FootnoteReference"/>
               </w:rPr>
-              <w:footnoteReference w:id="10"/>
+              <w:footnoteReference w:id="6"/>
             </w:r>
             <w:r>
               <w:t>.</w:t>
@@ -7401,21 +7185,21 @@
       <w:pPr>
         <w:pStyle w:val="Heading1"/>
       </w:pPr>
-      <w:bookmarkStart w:id="19" w:name="_Toc71057158"/>
+      <w:bookmarkStart w:id="18" w:name="_Toc71057158"/>
       <w:r>
         <w:t>API</w:t>
       </w:r>
+      <w:bookmarkEnd w:id="18"/>
+    </w:p>
+    <w:p>
+      <w:pPr>
+        <w:pStyle w:val="Heading2"/>
+      </w:pPr>
+      <w:bookmarkStart w:id="19" w:name="_Toc71057159"/>
+      <w:r>
+        <w:t>Error Handling</w:t>
+      </w:r>
       <w:bookmarkEnd w:id="19"/>
-    </w:p>
-    <w:p>
-      <w:pPr>
-        <w:pStyle w:val="Heading2"/>
-      </w:pPr>
-      <w:bookmarkStart w:id="20" w:name="_Toc71057159"/>
-      <w:r>
-        <w:t>Error Handling</w:t>
-      </w:r>
-      <w:bookmarkEnd w:id="20"/>
     </w:p>
     <w:p>
       <w:pPr>
@@ -7614,11 +7398,11 @@
       <w:pPr>
         <w:pStyle w:val="Heading2"/>
       </w:pPr>
-      <w:bookmarkStart w:id="21" w:name="_Toc71057160"/>
+      <w:bookmarkStart w:id="20" w:name="_Toc71057160"/>
       <w:r>
         <w:t>Debugging</w:t>
       </w:r>
-      <w:bookmarkEnd w:id="21"/>
+      <w:bookmarkEnd w:id="20"/>
     </w:p>
     <w:p>
       <w:pPr>
@@ -7824,11 +7608,11 @@
       <w:pPr>
         <w:pStyle w:val="Heading2"/>
       </w:pPr>
-      <w:bookmarkStart w:id="22" w:name="_Toc71057161"/>
+      <w:bookmarkStart w:id="21" w:name="_Toc71057161"/>
       <w:r>
         <w:t>Thread Services</w:t>
       </w:r>
-      <w:bookmarkEnd w:id="22"/>
+      <w:bookmarkEnd w:id="21"/>
     </w:p>
     <w:p>
       <w:pPr>
@@ -7902,7 +7686,7 @@
       <w:pPr>
         <w:pStyle w:val="Heading3"/>
       </w:pPr>
-      <w:bookmarkStart w:id="23" w:name="_Toc71057162"/>
+      <w:bookmarkStart w:id="22" w:name="_Toc71057162"/>
       <w:r>
         <w:lastRenderedPageBreak/>
         <w:t xml:space="preserve">Create </w:t>
@@ -7913,7 +7697,7 @@
       <w:r>
         <w:t>Thread</w:t>
       </w:r>
-      <w:bookmarkEnd w:id="23"/>
+      <w:bookmarkEnd w:id="22"/>
     </w:p>
     <w:p>
       <w:pPr>
@@ -8298,12 +8082,12 @@
       <w:pPr>
         <w:pStyle w:val="Heading3"/>
       </w:pPr>
+      <w:bookmarkStart w:id="23" w:name="_Toc71057164"/>
       <w:bookmarkStart w:id="24" w:name="_Toc71057163"/>
-      <w:bookmarkStart w:id="25" w:name="_Toc71057164"/>
       <w:r>
         <w:t>Yield to another thread.</w:t>
       </w:r>
-      <w:bookmarkEnd w:id="25"/>
+      <w:bookmarkEnd w:id="23"/>
     </w:p>
     <w:p>
       <w:pPr>
@@ -8649,14 +8433,14 @@
       <w:pPr>
         <w:pStyle w:val="Heading3"/>
       </w:pPr>
-      <w:bookmarkStart w:id="26" w:name="_Toc71057165"/>
+      <w:bookmarkStart w:id="25" w:name="_Toc71057165"/>
       <w:r>
         <w:t xml:space="preserve">Get </w:t>
       </w:r>
       <w:r>
         <w:t>A Thread’s Unique Identifier</w:t>
       </w:r>
-      <w:bookmarkEnd w:id="26"/>
+      <w:bookmarkEnd w:id="25"/>
     </w:p>
     <w:p>
       <w:pPr>
@@ -8702,6 +8486,7 @@
         <w:pStyle w:val="Heading4"/>
       </w:pPr>
       <w:r>
+        <w:lastRenderedPageBreak/>
         <w:t>P</w:t>
       </w:r>
       <w:r>
@@ -8817,7 +8602,7 @@
       <w:pPr>
         <w:pStyle w:val="Heading3"/>
       </w:pPr>
-      <w:bookmarkStart w:id="27" w:name="_Toc71057166"/>
+      <w:bookmarkStart w:id="26" w:name="_Toc71057166"/>
       <w:r>
         <w:t>Get a Return Value From a</w:t>
       </w:r>
@@ -8839,7 +8624,7 @@
       <w:r>
         <w:t xml:space="preserve"> Function</w:t>
       </w:r>
-      <w:bookmarkEnd w:id="27"/>
+      <w:bookmarkEnd w:id="26"/>
       <w:r>
         <w:t xml:space="preserve"> </w:t>
       </w:r>
@@ -9158,6 +8943,7 @@
         <w:pStyle w:val="Code"/>
       </w:pPr>
       <w:r>
+        <w:lastRenderedPageBreak/>
         <w:t>thread:</w:t>
       </w:r>
       <w:r>
@@ -9317,14 +9103,14 @@
       <w:pPr>
         <w:pStyle w:val="Heading2"/>
       </w:pPr>
-      <w:bookmarkStart w:id="28" w:name="_Toc71057167"/>
+      <w:bookmarkStart w:id="27" w:name="_Toc71057167"/>
       <w:r>
         <w:t xml:space="preserve">Signal </w:t>
       </w:r>
       <w:r>
         <w:t>Services</w:t>
       </w:r>
-      <w:bookmarkEnd w:id="28"/>
+      <w:bookmarkEnd w:id="27"/>
     </w:p>
     <w:p>
       <w:pPr>
@@ -9430,7 +9216,6 @@
               <w:pStyle w:val="Code"/>
             </w:pPr>
             <w:r>
-              <w:lastRenderedPageBreak/>
               <w:t>SIG_WAKEUP</w:t>
             </w:r>
           </w:p>
@@ -9461,11 +9246,11 @@
       <w:pPr>
         <w:pStyle w:val="Heading3"/>
       </w:pPr>
-      <w:bookmarkStart w:id="29" w:name="_Toc71057168"/>
+      <w:bookmarkStart w:id="28" w:name="_Toc71057168"/>
       <w:r>
         <w:t>Send a Signal To Another Thread</w:t>
       </w:r>
-      <w:bookmarkEnd w:id="29"/>
+      <w:bookmarkEnd w:id="28"/>
     </w:p>
     <w:p>
       <w:pPr>
@@ -9693,6 +9478,7 @@
               <w:ind w:left="0"/>
             </w:pPr>
             <w:r>
+              <w:lastRenderedPageBreak/>
               <w:t>result</w:t>
             </w:r>
           </w:p>
@@ -9717,14 +9503,14 @@
       <w:pPr>
         <w:pStyle w:val="Heading3"/>
       </w:pPr>
-      <w:bookmarkStart w:id="30" w:name="_Toc71057169"/>
+      <w:bookmarkStart w:id="29" w:name="_Toc71057169"/>
       <w:r>
         <w:t>Re</w:t>
       </w:r>
       <w:r>
         <w:t>trieve a Signal</w:t>
       </w:r>
-      <w:bookmarkEnd w:id="30"/>
+      <w:bookmarkEnd w:id="29"/>
     </w:p>
     <w:p>
       <w:pPr>
@@ -9818,7 +9604,6 @@
         <w:pStyle w:val="Heading4"/>
       </w:pPr>
       <w:r>
-        <w:lastRenderedPageBreak/>
         <w:t>Returns</w:t>
       </w:r>
     </w:p>
@@ -9926,10 +9711,28 @@
       <w:pPr>
         <w:pStyle w:val="Heading2"/>
       </w:pPr>
-      <w:bookmarkStart w:id="31" w:name="_Toc71057170"/>
+      <w:bookmarkStart w:id="30" w:name="_Toc71057170"/>
       <w:r>
         <w:t>Management Services</w:t>
       </w:r>
+      <w:bookmarkEnd w:id="30"/>
+    </w:p>
+    <w:p>
+      <w:pPr>
+        <w:pStyle w:val="Technical"/>
+      </w:pPr>
+      <w:r>
+        <w:t>Asynchronous programming, whether with preemptive or non-preemptive threads requires more than getting the syntax and the semantics correct. Tuning is a large part of getting an asynchronous program to run efficiently. These so-called management services are designed to give the programmer some control over the timing of program events. They allow an addon to query the runtime to obtain information about its threads and their execution environment.</w:t>
+      </w:r>
+    </w:p>
+    <w:p>
+      <w:pPr>
+        <w:pStyle w:val="Heading3"/>
+      </w:pPr>
+      <w:bookmarkStart w:id="31" w:name="_Toc71057171"/>
+      <w:r>
+        <w:t>Initialize the WoWThreads Library.</w:t>
+      </w:r>
       <w:bookmarkEnd w:id="31"/>
     </w:p>
     <w:p>
@@ -9937,105 +9740,88 @@
         <w:pStyle w:val="Technical"/>
       </w:pPr>
       <w:r>
-        <w:t>Asynchronous programming, whether with preemptive or non-preemptive threads requires more than getting the syntax and the semantics correct. Tuning is a large part of getting an asynchronous program to run efficiently. These so-called management services are designed to give the programmer some control over the timing of program events. They allow an addon to query the runtime to obtain information about its threads and their execution environment.</w:t>
+        <w:t xml:space="preserve">This service initializes the WoWThreads library. This </w:t>
+      </w:r>
+      <w:r>
+        <w:t>service is</w:t>
+      </w:r>
+      <w:r>
+        <w:t xml:space="preserve"> commonly placed in the ADDON_LOADED event handler.</w:t>
+      </w:r>
+    </w:p>
+    <w:p>
+      <w:pPr>
+        <w:pStyle w:val="Heading4"/>
+      </w:pPr>
+      <w:r>
+        <w:t>P</w:t>
+      </w:r>
+      <w:r>
+        <w:t>rototype</w:t>
+      </w:r>
+    </w:p>
+    <w:p>
+      <w:pPr>
+        <w:pStyle w:val="Code"/>
+      </w:pPr>
+      <w:r>
+        <w:t>mgmt:initWoWThreads()</w:t>
+      </w:r>
+    </w:p>
+    <w:p>
+      <w:pPr>
+        <w:pStyle w:val="Heading4"/>
+      </w:pPr>
+      <w:r>
+        <w:lastRenderedPageBreak/>
+        <w:t>P</w:t>
+      </w:r>
+      <w:r>
+        <w:t>arameters</w:t>
+      </w:r>
+    </w:p>
+    <w:p>
+      <w:pPr>
+        <w:pStyle w:val="Technical"/>
+      </w:pPr>
+      <w:r>
+        <w:t>None</w:t>
+      </w:r>
+    </w:p>
+    <w:p>
+      <w:pPr>
+        <w:pStyle w:val="Heading4"/>
+      </w:pPr>
+      <w:r>
+        <w:t>R</w:t>
+      </w:r>
+      <w:r>
+        <w:t>eturns</w:t>
+      </w:r>
+    </w:p>
+    <w:p>
+      <w:pPr>
+        <w:pStyle w:val="Technical"/>
+      </w:pPr>
+      <w:r>
+        <w:t>None</w:t>
       </w:r>
     </w:p>
     <w:p>
       <w:pPr>
         <w:pStyle w:val="Heading3"/>
       </w:pPr>
-      <w:bookmarkStart w:id="32" w:name="_Toc71057171"/>
-      <w:r>
-        <w:t>Initialize the WoWThreads Library.</w:t>
+      <w:bookmarkStart w:id="32" w:name="_Toc71057172"/>
+      <w:r>
+        <w:t xml:space="preserve">Get the yield interval for </w:t>
+      </w:r>
+      <w:r>
+        <w:t>a</w:t>
+      </w:r>
+      <w:r>
+        <w:t xml:space="preserve"> specified thread</w:t>
       </w:r>
       <w:bookmarkEnd w:id="32"/>
-    </w:p>
-    <w:p>
-      <w:pPr>
-        <w:pStyle w:val="Technical"/>
-      </w:pPr>
-      <w:r>
-        <w:t xml:space="preserve">This service initializes the WoWThreads library. This </w:t>
-      </w:r>
-      <w:r>
-        <w:t>service is</w:t>
-      </w:r>
-      <w:r>
-        <w:t xml:space="preserve"> commonly placed in the ADDON_LOADED event handler.</w:t>
-      </w:r>
-    </w:p>
-    <w:p>
-      <w:pPr>
-        <w:pStyle w:val="Heading4"/>
-      </w:pPr>
-      <w:r>
-        <w:t>P</w:t>
-      </w:r>
-      <w:r>
-        <w:t>rototype</w:t>
-      </w:r>
-    </w:p>
-    <w:p>
-      <w:pPr>
-        <w:pStyle w:val="Code"/>
-      </w:pPr>
-      <w:r>
-        <w:t>mgmt:initWoWThreads()</w:t>
-      </w:r>
-    </w:p>
-    <w:p>
-      <w:pPr>
-        <w:pStyle w:val="Heading4"/>
-      </w:pPr>
-      <w:r>
-        <w:t>P</w:t>
-      </w:r>
-      <w:r>
-        <w:t>arameters</w:t>
-      </w:r>
-    </w:p>
-    <w:p>
-      <w:pPr>
-        <w:pStyle w:val="Technical"/>
-      </w:pPr>
-      <w:r>
-        <w:t>None</w:t>
-      </w:r>
-    </w:p>
-    <w:p>
-      <w:pPr>
-        <w:pStyle w:val="Heading4"/>
-      </w:pPr>
-      <w:r>
-        <w:t>R</w:t>
-      </w:r>
-      <w:r>
-        <w:t>eturns</w:t>
-      </w:r>
-    </w:p>
-    <w:p>
-      <w:pPr>
-        <w:pStyle w:val="Technical"/>
-      </w:pPr>
-      <w:r>
-        <w:t>None</w:t>
-      </w:r>
-    </w:p>
-    <w:p>
-      <w:pPr>
-        <w:pStyle w:val="Heading3"/>
-      </w:pPr>
-      <w:bookmarkStart w:id="33" w:name="_Toc71057172"/>
-      <w:r>
-        <w:t xml:space="preserve">Get the yield interval for </w:t>
-      </w:r>
-      <w:r>
-        <w:t>a</w:t>
-      </w:r>
-      <w:r>
-        <w:t xml:space="preserve"> specified thread</w:t>
-      </w:r>
-      <w:bookmarkEnd w:id="33"/>
     </w:p>
     <w:p>
       <w:pPr>
@@ -10119,7 +9905,6 @@
         <w:pStyle w:val="Heading4"/>
       </w:pPr>
       <w:r>
-        <w:lastRenderedPageBreak/>
         <w:t>R</w:t>
       </w:r>
       <w:r>
@@ -10213,11 +9998,11 @@
       <w:pPr>
         <w:pStyle w:val="Heading3"/>
       </w:pPr>
-      <w:bookmarkStart w:id="34" w:name="_Toc71057173"/>
+      <w:bookmarkStart w:id="33" w:name="_Toc71057173"/>
       <w:r>
         <w:t>Set the yield interval for the specified thread</w:t>
       </w:r>
-      <w:bookmarkEnd w:id="34"/>
+      <w:bookmarkEnd w:id="33"/>
     </w:p>
     <w:p>
       <w:pPr>
@@ -10433,7 +10218,7 @@
       <w:pPr>
         <w:pStyle w:val="Heading3"/>
       </w:pPr>
-      <w:bookmarkStart w:id="35" w:name="_Toc71057174"/>
+      <w:bookmarkStart w:id="34" w:name="_Toc71057174"/>
       <w:r>
         <w:t xml:space="preserve">Get the clock </w:t>
       </w:r>
@@ -10443,7 +10228,7 @@
       <w:r>
         <w:t>interval</w:t>
       </w:r>
-      <w:bookmarkEnd w:id="35"/>
+      <w:bookmarkEnd w:id="34"/>
     </w:p>
     <w:p>
       <w:pPr>
@@ -10488,6 +10273,7 @@
         <w:pStyle w:val="Heading4"/>
       </w:pPr>
       <w:r>
+        <w:lastRenderedPageBreak/>
         <w:t>R</w:t>
       </w:r>
       <w:r>
@@ -10548,11 +10334,11 @@
       <w:pPr>
         <w:pStyle w:val="Heading3"/>
       </w:pPr>
-      <w:bookmarkStart w:id="36" w:name="_Toc71057175"/>
+      <w:bookmarkStart w:id="35" w:name="_Toc71057175"/>
       <w:r>
         <w:t>Get the number of threads in the running, suspended, dead, and normal states.</w:t>
       </w:r>
-      <w:bookmarkEnd w:id="36"/>
+      <w:bookmarkEnd w:id="35"/>
     </w:p>
     <w:p>
       <w:pPr>
@@ -10668,7 +10454,6 @@
               <w:pStyle w:val="Code"/>
             </w:pPr>
             <w:r>
-              <w:lastRenderedPageBreak/>
               <w:t>suspended</w:t>
             </w:r>
             <w:r>
@@ -10788,7 +10573,7 @@
       <w:pPr>
         <w:pStyle w:val="Heading3"/>
       </w:pPr>
-      <w:bookmarkStart w:id="37" w:name="_Toc71057176"/>
+      <w:bookmarkStart w:id="36" w:name="_Toc71057176"/>
       <w:r>
         <w:t>Get</w:t>
       </w:r>
@@ -10798,7 +10583,7 @@
       <w:r>
         <w:t>thread performance metrics</w:t>
       </w:r>
-      <w:bookmarkEnd w:id="37"/>
+      <w:bookmarkEnd w:id="36"/>
     </w:p>
     <w:p>
       <w:pPr>
@@ -11186,6 +10971,7 @@
         <w:ind w:left="720"/>
       </w:pPr>
       <w:r>
+        <w:lastRenderedPageBreak/>
         <w:t>Table of Metrics with the following values</w:t>
       </w:r>
     </w:p>
@@ -11193,39 +10979,39 @@
       <w:pPr>
         <w:pStyle w:val="Heading1"/>
       </w:pPr>
-      <w:bookmarkStart w:id="38" w:name="_Toc71057177"/>
+      <w:bookmarkStart w:id="37" w:name="_Toc71057177"/>
       <w:r>
         <w:t>Appendix</w:t>
       </w:r>
+      <w:bookmarkEnd w:id="37"/>
+    </w:p>
+    <w:p>
+      <w:pPr>
+        <w:pStyle w:val="Heading2"/>
+      </w:pPr>
+      <w:bookmarkStart w:id="38" w:name="_Toc71057178"/>
+      <w:r>
+        <w:t>Installation</w:t>
+      </w:r>
       <w:bookmarkEnd w:id="38"/>
     </w:p>
     <w:p>
       <w:pPr>
-        <w:pStyle w:val="Heading2"/>
-      </w:pPr>
-      <w:bookmarkStart w:id="39" w:name="_Toc71057178"/>
-      <w:r>
-        <w:t>Installation</w:t>
+        <w:pStyle w:val="Technical"/>
+      </w:pPr>
+      <w:r>
+        <w:t xml:space="preserve">WoWThreads is a library, not an application. So, the installation is just a little different. </w:t>
+      </w:r>
+    </w:p>
+    <w:p>
+      <w:pPr>
+        <w:pStyle w:val="Heading3"/>
+      </w:pPr>
+      <w:bookmarkStart w:id="39" w:name="_Toc71057179"/>
+      <w:r>
+        <w:t>TOC File</w:t>
       </w:r>
       <w:bookmarkEnd w:id="39"/>
-    </w:p>
-    <w:p>
-      <w:pPr>
-        <w:pStyle w:val="Technical"/>
-      </w:pPr>
-      <w:r>
-        <w:t xml:space="preserve">WoWThreads is a library, not an application. So, the installation is just a little different. </w:t>
-      </w:r>
-    </w:p>
-    <w:p>
-      <w:pPr>
-        <w:pStyle w:val="Heading3"/>
-      </w:pPr>
-      <w:bookmarkStart w:id="40" w:name="_Toc71057179"/>
-      <w:r>
-        <w:t>TOC File</w:t>
-      </w:r>
-      <w:bookmarkEnd w:id="40"/>
     </w:p>
     <w:p>
       <w:pPr>
@@ -11252,7 +11038,6 @@
         <w:ind w:left="360"/>
       </w:pPr>
       <w:r>
-        <w:lastRenderedPageBreak/>
         <w:t>Next, move to your AddOn</w:t>
       </w:r>
       <w:r>
@@ -11490,316 +11275,1002 @@
       <w:pPr>
         <w:pStyle w:val="Heading3"/>
       </w:pPr>
-      <w:bookmarkStart w:id="41" w:name="_Toc71057180"/>
+      <w:bookmarkStart w:id="40" w:name="_Toc71057180"/>
       <w:r>
         <w:t>File Header</w:t>
       </w:r>
+      <w:bookmarkEnd w:id="40"/>
+    </w:p>
+    <w:p>
+      <w:pPr>
+        <w:pStyle w:val="Technical"/>
+      </w:pPr>
+      <w:r>
+        <w:t xml:space="preserve">Here is the header declarations from </w:t>
+      </w:r>
+      <w:r>
+        <w:t>the Main</w:t>
+      </w:r>
+      <w:r>
+        <w:t>.lua file</w:t>
+      </w:r>
+      <w:r>
+        <w:t xml:space="preserve"> in the demo addon, CombatLogger</w:t>
+      </w:r>
+      <w:r>
+        <w:t>. These declaration</w:t>
+      </w:r>
+      <w:r>
+        <w:t>s</w:t>
+      </w:r>
+      <w:r>
+        <w:t xml:space="preserve"> import all the symbols you’ll need to run Talon out of the box.</w:t>
+      </w:r>
+    </w:p>
+    <w:p>
+      <w:pPr>
+        <w:pStyle w:val="Code"/>
+      </w:pPr>
+      <w:r>
+        <w:t>------------------------------------------------</w:t>
+      </w:r>
+    </w:p>
+    <w:p>
+      <w:pPr>
+        <w:pStyle w:val="Code"/>
+      </w:pPr>
+      <w:r>
+        <w:t xml:space="preserve">-- Main.lua </w:t>
+      </w:r>
+    </w:p>
+    <w:p>
+      <w:pPr>
+        <w:pStyle w:val="Code"/>
+      </w:pPr>
+      <w:r>
+        <w:t>-- AUTHOR: Michael Peterson</w:t>
+      </w:r>
+    </w:p>
+    <w:p>
+      <w:pPr>
+        <w:pStyle w:val="Code"/>
+      </w:pPr>
+      <w:r>
+        <w:t>-- ORIGINAL DATE: 9 March, 2021</w:t>
+      </w:r>
+    </w:p>
+    <w:p>
+      <w:pPr>
+        <w:pStyle w:val="Code"/>
+      </w:pPr>
+      <w:r>
+        <w:t>local _, CombatLogger = ...</w:t>
+      </w:r>
+    </w:p>
+    <w:p>
+      <w:pPr>
+        <w:pStyle w:val="Code"/>
+      </w:pPr>
+      <w:r>
+        <w:t>CombatLogger.Main = {}</w:t>
+      </w:r>
+    </w:p>
+    <w:p>
+      <w:pPr>
+        <w:pStyle w:val="Code"/>
+      </w:pPr>
+      <w:r>
+        <w:t>main = CombatLogger.Main</w:t>
+      </w:r>
+    </w:p>
+    <w:p>
+      <w:pPr>
+        <w:pStyle w:val="Code"/>
+      </w:pPr>
+    </w:p>
+    <w:p>
+      <w:pPr>
+        <w:pStyle w:val="Code"/>
+      </w:pPr>
+      <w:r>
+        <w:t>local fileName = "Main.lua"</w:t>
+      </w:r>
+    </w:p>
+    <w:p>
+      <w:pPr>
+        <w:pStyle w:val="Code"/>
+      </w:pPr>
+    </w:p>
+    <w:p>
+      <w:pPr>
+        <w:pStyle w:val="Code"/>
+      </w:pPr>
+      <w:r>
+        <w:t>local E = errors</w:t>
+      </w:r>
+    </w:p>
+    <w:p>
+      <w:pPr>
+        <w:pStyle w:val="Code"/>
+      </w:pPr>
+      <w:r>
+        <w:t>local DEBUG = errors.DEBUG</w:t>
+      </w:r>
+    </w:p>
+    <w:p>
+      <w:pPr>
+        <w:pStyle w:val="Code"/>
+      </w:pPr>
+      <w:r>
+        <w:t>local sprintf = _G.string.format</w:t>
+      </w:r>
+    </w:p>
+    <w:p>
+      <w:pPr>
+        <w:pStyle w:val="Code"/>
+      </w:pPr>
+    </w:p>
+    <w:p>
+      <w:pPr>
+        <w:pStyle w:val="Code"/>
+      </w:pPr>
+      <w:r>
+        <w:t>local SUCCESS</w:t>
+      </w:r>
+      <w:r>
+        <w:t xml:space="preserve"> </w:t>
+      </w:r>
+      <w:r>
+        <w:t>= errors.STATUS_SUCCESS</w:t>
+      </w:r>
+    </w:p>
+    <w:p>
+      <w:pPr>
+        <w:pStyle w:val="Code"/>
+      </w:pPr>
+      <w:r>
+        <w:t>local FAILURE</w:t>
+      </w:r>
+      <w:r>
+        <w:t xml:space="preserve"> </w:t>
+      </w:r>
+      <w:r>
+        <w:t>= errors.STATUS_FAILURE</w:t>
+      </w:r>
+    </w:p>
+    <w:p>
+      <w:pPr>
+        <w:pStyle w:val="Code"/>
+      </w:pPr>
+    </w:p>
+    <w:p>
+      <w:pPr>
+        <w:pStyle w:val="Code"/>
+      </w:pPr>
+      <w:r>
+        <w:t>local SIG_NONE</w:t>
+      </w:r>
+      <w:r>
+        <w:t xml:space="preserve">    </w:t>
+      </w:r>
+      <w:r>
+        <w:t xml:space="preserve">= timer.SIG_NONE </w:t>
+      </w:r>
+    </w:p>
+    <w:p>
+      <w:pPr>
+        <w:pStyle w:val="Code"/>
+      </w:pPr>
+      <w:r>
+        <w:t>local SIG_RETURN</w:t>
+      </w:r>
+      <w:r>
+        <w:t xml:space="preserve">    </w:t>
+      </w:r>
+      <w:r>
+        <w:t>= timer.SIG_RETURN</w:t>
+      </w:r>
+    </w:p>
+    <w:p>
+      <w:pPr>
+        <w:pStyle w:val="Code"/>
+      </w:pPr>
+      <w:r>
+        <w:t>local SIG_WAKEUP</w:t>
+      </w:r>
+      <w:r>
+        <w:t xml:space="preserve">    </w:t>
+      </w:r>
+      <w:r>
+        <w:t>= timer.SIG_WAKEUP</w:t>
+      </w:r>
+    </w:p>
+    <w:p>
+      <w:pPr>
+        <w:pStyle w:val="Code"/>
+      </w:pPr>
+      <w:r>
+        <w:t>local SIG_NUMBER_OF</w:t>
+      </w:r>
+      <w:r>
+        <w:t xml:space="preserve">  </w:t>
+      </w:r>
+      <w:r>
+        <w:t>= timer.SIG_WAKEUP</w:t>
+      </w:r>
+    </w:p>
+    <w:p>
+      <w:pPr>
+        <w:pStyle w:val="Code"/>
+      </w:pPr>
+    </w:p>
+    <w:p>
+      <w:pPr>
+        <w:pStyle w:val="Code"/>
+      </w:pPr>
+      <w:r>
+        <w:t>… Your Addon</w:t>
+      </w:r>
+      <w:r>
+        <w:t xml:space="preserve">’s </w:t>
+      </w:r>
+      <w:r>
+        <w:t xml:space="preserve">specific </w:t>
+      </w:r>
+      <w:r>
+        <w:t>symbols and</w:t>
+      </w:r>
+      <w:r>
+        <w:t xml:space="preserve"> code goes here</w:t>
+      </w:r>
+    </w:p>
+    <w:p>
+      <w:pPr>
+        <w:pStyle w:val="Heading2"/>
+      </w:pPr>
+      <w:bookmarkStart w:id="41" w:name="_Toc71057181"/>
+      <w:r>
+        <w:t>Example</w:t>
+      </w:r>
+      <w:r>
+        <w:t>s</w:t>
+      </w:r>
       <w:bookmarkEnd w:id="41"/>
     </w:p>
     <w:p>
       <w:pPr>
+        <w:pStyle w:val="Heading3"/>
+      </w:pPr>
+      <w:r>
+        <w:t>Hello World</w:t>
+      </w:r>
+    </w:p>
+    <w:p>
+      <w:pPr>
         <w:pStyle w:val="Technical"/>
       </w:pPr>
       <w:r>
-        <w:t xml:space="preserve">Here is the header declarations from </w:t>
-      </w:r>
-      <w:r>
-        <w:t>the Main</w:t>
-      </w:r>
-      <w:r>
-        <w:t>.lua file</w:t>
-      </w:r>
-      <w:r>
-        <w:t xml:space="preserve"> in the demo addon, CombatLogger</w:t>
-      </w:r>
-      <w:r>
-        <w:t>. These declaration</w:t>
-      </w:r>
-      <w:r>
-        <w:t>s</w:t>
-      </w:r>
-      <w:r>
-        <w:t xml:space="preserve"> import all the symbols you’ll need to run Talon out of the box.</w:t>
-      </w:r>
-    </w:p>
-    <w:p>
-      <w:pPr>
-        <w:pStyle w:val="Code"/>
-      </w:pPr>
-      <w:r>
-        <w:t>------------------------------------------------</w:t>
-      </w:r>
-    </w:p>
-    <w:p>
-      <w:pPr>
-        <w:pStyle w:val="Code"/>
-      </w:pPr>
-      <w:r>
-        <w:t xml:space="preserve">-- Main.lua </w:t>
-      </w:r>
-    </w:p>
-    <w:p>
-      <w:pPr>
-        <w:pStyle w:val="Code"/>
-      </w:pPr>
-      <w:r>
-        <w:t>-- AUTHOR: Michael Peterson</w:t>
-      </w:r>
-    </w:p>
-    <w:p>
-      <w:pPr>
-        <w:pStyle w:val="Code"/>
-      </w:pPr>
-      <w:r>
-        <w:t>-- ORIGINAL DATE: 9 March, 2021</w:t>
-      </w:r>
-    </w:p>
-    <w:p>
-      <w:pPr>
-        <w:pStyle w:val="Code"/>
-      </w:pPr>
-      <w:r>
-        <w:t>local _, CombatLogger = ...</w:t>
-      </w:r>
-    </w:p>
-    <w:p>
-      <w:pPr>
-        <w:pStyle w:val="Code"/>
-      </w:pPr>
-      <w:r>
-        <w:t>CombatLogger.Main = {}</w:t>
-      </w:r>
-    </w:p>
-    <w:p>
-      <w:pPr>
-        <w:pStyle w:val="Code"/>
-      </w:pPr>
-      <w:r>
-        <w:t>main = CombatLogger.Main</w:t>
-      </w:r>
-    </w:p>
-    <w:p>
-      <w:pPr>
-        <w:pStyle w:val="Code"/>
-      </w:pPr>
-    </w:p>
-    <w:p>
-      <w:pPr>
-        <w:pStyle w:val="Code"/>
-      </w:pPr>
-      <w:r>
-        <w:t>local fileName = "Main.lua"</w:t>
-      </w:r>
-    </w:p>
-    <w:p>
-      <w:pPr>
-        <w:pStyle w:val="Code"/>
-      </w:pPr>
-    </w:p>
-    <w:p>
-      <w:pPr>
-        <w:pStyle w:val="Code"/>
-      </w:pPr>
-      <w:r>
-        <w:t>local E = errors</w:t>
-      </w:r>
-    </w:p>
-    <w:p>
-      <w:pPr>
-        <w:pStyle w:val="Code"/>
-      </w:pPr>
-      <w:r>
-        <w:t>local DEBUG = errors.DEBUG</w:t>
-      </w:r>
-    </w:p>
-    <w:p>
-      <w:pPr>
-        <w:pStyle w:val="Code"/>
-      </w:pPr>
-      <w:r>
-        <w:t>local sprintf = _G.string.format</w:t>
-      </w:r>
-    </w:p>
-    <w:p>
-      <w:pPr>
-        <w:pStyle w:val="Code"/>
-      </w:pPr>
-    </w:p>
-    <w:p>
-      <w:pPr>
-        <w:pStyle w:val="Code"/>
-      </w:pPr>
-      <w:r>
-        <w:t>local SUCCESS</w:t>
-      </w:r>
-      <w:r>
-        <w:t xml:space="preserve"> </w:t>
-      </w:r>
-      <w:r>
-        <w:t>= errors.STATUS_SUCCESS</w:t>
-      </w:r>
-    </w:p>
-    <w:p>
-      <w:pPr>
-        <w:pStyle w:val="Code"/>
-      </w:pPr>
-      <w:r>
-        <w:t>local FAILURE</w:t>
-      </w:r>
-      <w:r>
-        <w:t xml:space="preserve"> </w:t>
-      </w:r>
-      <w:r>
-        <w:t>= errors.STATUS_FAILURE</w:t>
-      </w:r>
-    </w:p>
-    <w:p>
-      <w:pPr>
-        <w:pStyle w:val="Code"/>
-      </w:pPr>
-    </w:p>
-    <w:p>
-      <w:pPr>
-        <w:pStyle w:val="Code"/>
-      </w:pPr>
-      <w:r>
-        <w:t>local SIG_NONE</w:t>
-      </w:r>
-      <w:r>
-        <w:t xml:space="preserve">    </w:t>
-      </w:r>
-      <w:r>
-        <w:t xml:space="preserve">= timer.SIG_NONE </w:t>
-      </w:r>
-    </w:p>
-    <w:p>
-      <w:pPr>
-        <w:pStyle w:val="Code"/>
-      </w:pPr>
-      <w:r>
-        <w:lastRenderedPageBreak/>
-        <w:t>local SIG_RETURN</w:t>
-      </w:r>
-      <w:r>
-        <w:t xml:space="preserve">    </w:t>
-      </w:r>
-      <w:r>
-        <w:t>= timer.SIG_RETURN</w:t>
-      </w:r>
-    </w:p>
-    <w:p>
-      <w:pPr>
-        <w:pStyle w:val="Code"/>
-      </w:pPr>
-      <w:r>
-        <w:t>local SIG_WAKEUP</w:t>
-      </w:r>
-      <w:r>
-        <w:t xml:space="preserve">    </w:t>
-      </w:r>
-      <w:r>
-        <w:t>= timer.SIG_WAKEUP</w:t>
-      </w:r>
-    </w:p>
-    <w:p>
-      <w:pPr>
-        <w:pStyle w:val="Code"/>
-      </w:pPr>
-      <w:r>
-        <w:t>local SIG_NUMBER_OF</w:t>
-      </w:r>
-      <w:r>
-        <w:t xml:space="preserve">  </w:t>
-      </w:r>
-      <w:r>
-        <w:t>= timer.SIG_WAKEUP</w:t>
-      </w:r>
-    </w:p>
-    <w:p>
-      <w:pPr>
-        <w:pStyle w:val="Code"/>
-      </w:pPr>
-    </w:p>
-    <w:p>
-      <w:pPr>
-        <w:pStyle w:val="Code"/>
-      </w:pPr>
-      <w:r>
-        <w:t>… Your Addon</w:t>
-      </w:r>
-      <w:r>
-        <w:t xml:space="preserve">’s </w:t>
-      </w:r>
-      <w:r>
-        <w:t xml:space="preserve">specific </w:t>
-      </w:r>
-      <w:r>
-        <w:t>symbols and</w:t>
-      </w:r>
-      <w:r>
-        <w:t xml:space="preserve"> code goes here</w:t>
-      </w:r>
-    </w:p>
-    <w:p>
-      <w:pPr>
-        <w:pStyle w:val="Heading2"/>
-      </w:pPr>
-      <w:bookmarkStart w:id="42" w:name="_Toc71057181"/>
-      <w:r>
-        <w:t>Example</w:t>
-      </w:r>
-      <w:r>
-        <w:t>s</w:t>
-      </w:r>
-      <w:bookmarkEnd w:id="42"/>
-    </w:p>
-    <w:p>
-      <w:pPr>
-        <w:pStyle w:val="Heading3"/>
-      </w:pPr>
-      <w:bookmarkStart w:id="43" w:name="_Toc71057182"/>
-      <w:r>
-        <w:t>Demo Application – A Simple Combat Log</w:t>
-      </w:r>
-      <w:bookmarkEnd w:id="43"/>
+        <w:t xml:space="preserve">What would a programmer’s guide be without </w:t>
+      </w:r>
+      <w:r>
+        <w:t>it’s version of the inestimable</w:t>
+      </w:r>
+      <w:r>
+        <w:t xml:space="preserve"> “Hello World” program. T</w:t>
+      </w:r>
+      <w:r>
+        <w:t xml:space="preserve">o do this, this demo </w:t>
+      </w:r>
+      <w:r>
+        <w:t xml:space="preserve">creates a greeter thread </w:t>
+      </w:r>
+      <w:r>
+        <w:t>t</w:t>
+      </w:r>
+      <w:r>
+        <w:t>hat, when signaled, prints “Hello World!” to the chat window</w:t>
+      </w:r>
+      <w:r>
+        <w:t>. The code flow proceeds as follows:</w:t>
+      </w:r>
     </w:p>
     <w:p>
       <w:pPr>
         <w:pStyle w:val="Technical"/>
-      </w:pPr>
-      <w:r>
-        <w:t>This</w:t>
-      </w:r>
-      <w:r>
-        <w:t xml:space="preserve"> demo application is designed to illustrate </w:t>
-      </w:r>
-      <w:r>
-        <w:t>the produce</w:t>
-      </w:r>
-      <w:r>
-        <w:t>r</w:t>
-      </w:r>
-      <w:r>
-        <w:t>-consumer pattern using Talon threads in a working addon.</w:t>
-      </w:r>
-      <w:r>
-        <w:t xml:space="preserve"> In this example, the producer is that </w:t>
+        <w:numPr>
+          <w:ilvl w:val="0"/>
+          <w:numId w:val="35"/>
+        </w:numPr>
+        <w:spacing w:before="120" w:after="120" w:line="240" w:lineRule="auto"/>
+      </w:pPr>
+      <w:r>
+        <w:t>A</w:t>
+      </w:r>
+      <w:r>
+        <w:t xml:space="preserve"> main thread is created.</w:t>
+      </w:r>
+    </w:p>
+    <w:p>
+      <w:pPr>
+        <w:pStyle w:val="Technical"/>
+        <w:numPr>
+          <w:ilvl w:val="0"/>
+          <w:numId w:val="35"/>
+        </w:numPr>
+        <w:spacing w:before="120" w:after="120" w:line="240" w:lineRule="auto"/>
+      </w:pPr>
+      <w:r>
+        <w:t>The main thread creates the greeter thread.</w:t>
+      </w:r>
+    </w:p>
+    <w:p>
+      <w:pPr>
+        <w:pStyle w:val="Technical"/>
+        <w:numPr>
+          <w:ilvl w:val="0"/>
+          <w:numId w:val="35"/>
+        </w:numPr>
+        <w:spacing w:before="120" w:after="120" w:line="240" w:lineRule="auto"/>
+      </w:pPr>
+      <w:r>
+        <w:t>The main thread signals the greeter thread to greet us.</w:t>
+      </w:r>
+    </w:p>
+    <w:p>
+      <w:pPr>
+        <w:pStyle w:val="Technical"/>
+        <w:numPr>
+          <w:ilvl w:val="0"/>
+          <w:numId w:val="35"/>
+        </w:numPr>
+        <w:spacing w:before="120" w:after="120" w:line="240" w:lineRule="auto"/>
+      </w:pPr>
+      <w:r>
+        <w:t>The main thread enters a while loop waiting for SIG_RETURN</w:t>
+      </w:r>
+    </w:p>
+    <w:p>
+      <w:pPr>
+        <w:pStyle w:val="Technical"/>
+        <w:numPr>
+          <w:ilvl w:val="0"/>
+          <w:numId w:val="35"/>
+        </w:numPr>
+        <w:spacing w:before="120" w:after="120" w:line="240" w:lineRule="auto"/>
+      </w:pPr>
+      <w:r>
+        <w:t>The greeter thread receives the signal and issues the greeting.</w:t>
+      </w:r>
+    </w:p>
+    <w:p>
+      <w:pPr>
+        <w:pStyle w:val="Technical"/>
+        <w:numPr>
+          <w:ilvl w:val="0"/>
+          <w:numId w:val="35"/>
+        </w:numPr>
+        <w:spacing w:before="120" w:after="120" w:line="240" w:lineRule="auto"/>
+      </w:pPr>
+      <w:r>
+        <w:t>The greeter thread signals the main thread to exit (SIG_RETURN)</w:t>
+      </w:r>
+    </w:p>
+    <w:p>
+      <w:pPr>
+        <w:pStyle w:val="Technical"/>
+        <w:numPr>
+          <w:ilvl w:val="0"/>
+          <w:numId w:val="35"/>
+        </w:numPr>
+        <w:spacing w:before="120"/>
+      </w:pPr>
+      <w:r>
+        <w:t>The main thread receives SIG_RETURN and terminates.</w:t>
+      </w:r>
+    </w:p>
+    <w:p>
+      <w:pPr>
+        <w:pStyle w:val="Technical"/>
+      </w:pPr>
+      <w:r>
+        <w:t>We begin by defining</w:t>
+      </w:r>
+      <w:r>
+        <w:t xml:space="preserve"> the greeter thread’s function</w:t>
+      </w:r>
+      <w:r>
+        <w:t xml:space="preserve">, </w:t>
       </w:r>
       <w:r>
         <w:rPr>
           <w:i/>
           <w:iCs/>
         </w:rPr>
+        <w:t>greet()</w:t>
+      </w:r>
+      <w:r>
+        <w:t xml:space="preserve">. The </w:t>
+      </w:r>
+      <w:r>
+        <w:t xml:space="preserve">function’s </w:t>
+      </w:r>
+      <w:r>
+        <w:t>pattern</w:t>
+      </w:r>
+      <w:r>
+        <w:t>, like almost all thread function patterns,</w:t>
+      </w:r>
+      <w:r>
+        <w:t xml:space="preserve"> is </w:t>
+      </w:r>
+      <w:r>
+        <w:t xml:space="preserve">a </w:t>
+      </w:r>
+      <w:r>
+        <w:t>while loop</w:t>
+      </w:r>
+      <w:r>
+        <w:t>.</w:t>
+      </w:r>
+      <w:r>
+        <w:t xml:space="preserve"> In this loop the thread yields and waits to receive a SIG_WAKEUP</w:t>
+      </w:r>
+      <w:r>
+        <w:t xml:space="preserve"> signal</w:t>
+      </w:r>
+      <w:r>
+        <w:t xml:space="preserve"> When the signal arrives, </w:t>
+      </w:r>
+      <w:r>
+        <w:t>greeter</w:t>
+      </w:r>
+      <w:r>
+        <w:t xml:space="preserve"> prints </w:t>
+      </w:r>
+      <w:r>
+        <w:t>“Hello World!”</w:t>
+      </w:r>
+      <w:r>
+        <w:t xml:space="preserve">, exits the loop, </w:t>
+      </w:r>
+      <w:r>
+        <w:t>sends SIG_RETURN to</w:t>
+      </w:r>
+      <w:r>
+        <w:t xml:space="preserve"> the main thread (for reasons described below), </w:t>
+      </w:r>
+      <w:r>
+        <w:t>and terminates.</w:t>
+      </w:r>
+    </w:p>
+    <w:p>
+      <w:pPr>
+        <w:pStyle w:val="Technical"/>
+      </w:pPr>
+      <w:r>
+        <w:t>So, let’s get into the actual code: w</w:t>
+      </w:r>
+      <w:r>
+        <w:t xml:space="preserve">e begin by declaring the handles for our two threads, and then defining the </w:t>
+      </w:r>
+      <w:r>
+        <w:rPr>
+          <w:i/>
+          <w:iCs/>
+        </w:rPr>
+        <w:t>greet()</w:t>
+      </w:r>
+      <w:r>
+        <w:t xml:space="preserve"> function.</w:t>
+      </w:r>
+    </w:p>
+    <w:p>
+      <w:pPr>
+        <w:pStyle w:val="Code"/>
+      </w:pPr>
+      <w:r>
+        <w:t>local greeter_h = nil</w:t>
+      </w:r>
+    </w:p>
+    <w:p>
+      <w:pPr>
+        <w:pStyle w:val="Code"/>
+      </w:pPr>
+      <w:r>
+        <w:t>local main_h = nil</w:t>
+      </w:r>
+    </w:p>
+    <w:p>
+      <w:pPr>
+        <w:pStyle w:val="Code"/>
+      </w:pPr>
+    </w:p>
+    <w:p>
+      <w:pPr>
+        <w:pStyle w:val="Code"/>
+      </w:pPr>
+      <w:r>
+        <w:t>local function greet()</w:t>
+      </w:r>
+    </w:p>
+    <w:p>
+      <w:pPr>
+        <w:pStyle w:val="Code"/>
+        <w:ind w:left="1440"/>
+      </w:pPr>
+      <w:r>
+        <w:t>local signal = SIG_NONE</w:t>
+      </w:r>
+    </w:p>
+    <w:p>
+      <w:pPr>
+        <w:pStyle w:val="Code"/>
+        <w:ind w:left="1440"/>
+      </w:pPr>
+    </w:p>
+    <w:p>
+      <w:pPr>
+        <w:pStyle w:val="Code"/>
+        <w:ind w:left="1440"/>
+      </w:pPr>
+      <w:r>
+        <w:t>while signal ~= SIG_WAKEUP do</w:t>
+      </w:r>
+    </w:p>
+    <w:p>
+      <w:pPr>
+        <w:pStyle w:val="Code"/>
+        <w:ind w:left="2160"/>
+        <w:rPr>
+          <w:b/>
+          <w:bCs/>
+        </w:rPr>
+      </w:pPr>
+      <w:r>
+        <w:rPr>
+          <w:b/>
+          <w:bCs/>
+        </w:rPr>
+        <w:lastRenderedPageBreak/>
+        <w:t>thread:yield()</w:t>
+      </w:r>
+    </w:p>
+    <w:p>
+      <w:pPr>
+        <w:pStyle w:val="Code"/>
+        <w:ind w:left="2160"/>
+        <w:rPr>
+          <w:b/>
+          <w:bCs/>
+        </w:rPr>
+      </w:pPr>
+      <w:r>
+        <w:rPr>
+          <w:b/>
+          <w:bCs/>
+        </w:rPr>
+        <w:t>signal = thread:getSignal()</w:t>
+      </w:r>
+    </w:p>
+    <w:p>
+      <w:pPr>
+        <w:pStyle w:val="Code"/>
+        <w:ind w:left="2160"/>
+      </w:pPr>
+      <w:r>
+        <w:t>if signal == SIG_WAKEUP then</w:t>
+      </w:r>
+    </w:p>
+    <w:p>
+      <w:pPr>
+        <w:pStyle w:val="Code"/>
+        <w:ind w:left="2880"/>
+      </w:pPr>
+      <w:r>
+        <w:t>print(“Hello World!” )</w:t>
+      </w:r>
+    </w:p>
+    <w:p>
+      <w:pPr>
+        <w:pStyle w:val="Code"/>
+        <w:ind w:left="2160"/>
+      </w:pPr>
+      <w:r>
+        <w:t>end</w:t>
+      </w:r>
+    </w:p>
+    <w:p>
+      <w:pPr>
+        <w:pStyle w:val="Code"/>
+        <w:ind w:left="1440"/>
+      </w:pPr>
+      <w:r>
+        <w:t>end</w:t>
+      </w:r>
+    </w:p>
+    <w:p>
+      <w:pPr>
+        <w:pStyle w:val="Code"/>
+        <w:ind w:left="1440"/>
+        <w:rPr>
+          <w:b/>
+          <w:bCs/>
+        </w:rPr>
+      </w:pPr>
+      <w:r>
+        <w:rPr>
+          <w:b/>
+          <w:bCs/>
+        </w:rPr>
+        <w:t xml:space="preserve">thread:signal( </w:t>
+      </w:r>
+      <w:r>
+        <w:rPr>
+          <w:b/>
+          <w:bCs/>
+        </w:rPr>
+        <w:t>main_h, SIG_RETURN )</w:t>
+      </w:r>
+    </w:p>
+    <w:p>
+      <w:pPr>
+        <w:pStyle w:val="Code"/>
+      </w:pPr>
+      <w:r>
+        <w:t>end</w:t>
+      </w:r>
+    </w:p>
+    <w:p>
+      <w:pPr>
+        <w:pStyle w:val="Technical"/>
+      </w:pPr>
+      <w:r>
+        <w:t xml:space="preserve">Now, we create the greeter thread </w:t>
+      </w:r>
+      <w:r>
+        <w:t>(</w:t>
+      </w:r>
+      <w:r>
+        <w:t xml:space="preserve">which </w:t>
+      </w:r>
+      <w:r>
+        <w:t xml:space="preserve">will </w:t>
+      </w:r>
+      <w:r>
+        <w:t xml:space="preserve">execute the </w:t>
+      </w:r>
+      <w:r>
+        <w:rPr>
+          <w:i/>
+          <w:iCs/>
+        </w:rPr>
+        <w:t>greet()</w:t>
+      </w:r>
+      <w:r>
+        <w:t xml:space="preserve"> function</w:t>
+      </w:r>
+      <w:r>
+        <w:t>)</w:t>
+      </w:r>
+      <w:r>
+        <w:t xml:space="preserve">. But, first recall that the call to </w:t>
+      </w:r>
+      <w:r>
+        <w:rPr>
+          <w:i/>
+          <w:iCs/>
+        </w:rPr>
+        <w:t>thread:yield()</w:t>
+      </w:r>
+      <w:r>
+        <w:t xml:space="preserve"> must occur within a thread context which means, for all intents and purposes, that it must be called from another thread. </w:t>
+      </w:r>
+      <w:r>
+        <w:t>My choice of names for these “generator” threads is … main(). So, before we can create the greeter thread, we must create its creator, the main thread.</w:t>
+      </w:r>
+    </w:p>
+    <w:p>
+      <w:pPr>
+        <w:pStyle w:val="Technical"/>
+      </w:pPr>
+      <w:r>
+        <w:t>Upon successful creation, the main thread immediately creates the greeter thread. The greeter thread then signals the greeter thread with SIG_WAKEUP which results in the greeter thread publishing “Hello World!” to the chat window and exiting the while loop thus terminating the thread. But after exiting the loop but before it returns (and terminates!), i</w:t>
+      </w:r>
+      <w:r>
+        <w:t>t</w:t>
+      </w:r>
+      <w:r>
+        <w:t xml:space="preserve"> sends the main thread </w:t>
+      </w:r>
+      <w:r>
+        <w:t>a</w:t>
+      </w:r>
+      <w:r>
+        <w:t xml:space="preserve"> SIG_RETURN signal which causes it to exit the loop and terminate, thus terminating the application.</w:t>
+      </w:r>
+    </w:p>
+    <w:p>
+      <w:pPr>
+        <w:pStyle w:val="Code"/>
+      </w:pPr>
+      <w:r>
+        <w:t>local function main()</w:t>
+      </w:r>
+    </w:p>
+    <w:p>
+      <w:pPr>
+        <w:pStyle w:val="Code"/>
+        <w:ind w:left="1440"/>
+        <w:rPr>
+          <w:b/>
+          <w:bCs/>
+        </w:rPr>
+      </w:pPr>
+      <w:r>
+        <w:t xml:space="preserve">local signal = </w:t>
+      </w:r>
+      <w:r>
+        <w:rPr>
+          <w:b/>
+          <w:bCs/>
+        </w:rPr>
+        <w:t>SIG_NONE</w:t>
+      </w:r>
+    </w:p>
+    <w:p>
+      <w:pPr>
+        <w:pStyle w:val="Code"/>
+        <w:ind w:left="1440"/>
+      </w:pPr>
+      <w:r>
+        <w:t xml:space="preserve">local greeter_h, result = </w:t>
+      </w:r>
+      <w:r>
+        <w:rPr>
+          <w:b/>
+          <w:bCs/>
+        </w:rPr>
+        <w:t>thread:create</w:t>
+      </w:r>
+      <w:r>
+        <w:rPr>
+          <w:b/>
+          <w:bCs/>
+        </w:rPr>
+        <w:t>( yieldInterval, greet() )</w:t>
+      </w:r>
+    </w:p>
+    <w:p>
+      <w:pPr>
+        <w:pStyle w:val="Code"/>
+        <w:ind w:left="1440"/>
+      </w:pPr>
+      <w:r>
+        <w:t>if greeter_h == nil then</w:t>
+      </w:r>
+    </w:p>
+    <w:p>
+      <w:pPr>
+        <w:pStyle w:val="Code"/>
+        <w:ind w:left="2160"/>
+      </w:pPr>
+      <w:r>
+        <w:rPr>
+          <w:b/>
+          <w:bCs/>
+        </w:rPr>
+        <w:t>mf:postResult</w:t>
+      </w:r>
+      <w:r>
+        <w:t>( result )</w:t>
+      </w:r>
+    </w:p>
+    <w:p>
+      <w:pPr>
+        <w:pStyle w:val="Code"/>
+        <w:ind w:left="1440"/>
+      </w:pPr>
+      <w:r>
+        <w:t>end</w:t>
+      </w:r>
+    </w:p>
+    <w:p>
+      <w:pPr>
+        <w:pStyle w:val="Code"/>
+        <w:ind w:left="1440"/>
+      </w:pPr>
+    </w:p>
+    <w:p>
+      <w:pPr>
+        <w:pStyle w:val="Code"/>
+        <w:ind w:left="1440"/>
+      </w:pPr>
+      <w:r>
+        <w:rPr>
+          <w:b/>
+          <w:bCs/>
+        </w:rPr>
+        <w:t>thread:signal( greeter_h, SIG_WAKEUP )</w:t>
+      </w:r>
+    </w:p>
+    <w:p>
+      <w:pPr>
+        <w:pStyle w:val="Code"/>
+        <w:ind w:left="1440"/>
+      </w:pPr>
+      <w:r>
+        <w:t xml:space="preserve">while signal ~= </w:t>
+      </w:r>
+      <w:r>
+        <w:rPr>
+          <w:b/>
+          <w:bCs/>
+        </w:rPr>
+        <w:t>SIG_RETURN</w:t>
+      </w:r>
+      <w:r>
+        <w:t xml:space="preserve"> do</w:t>
+      </w:r>
+    </w:p>
+    <w:p>
+      <w:pPr>
+        <w:pStyle w:val="Code"/>
+        <w:ind w:left="2160"/>
+        <w:rPr>
+          <w:b/>
+          <w:bCs/>
+        </w:rPr>
+      </w:pPr>
+      <w:r>
+        <w:rPr>
+          <w:b/>
+          <w:bCs/>
+        </w:rPr>
+        <w:t>thread:yield()</w:t>
+      </w:r>
+    </w:p>
+    <w:p>
+      <w:pPr>
+        <w:pStyle w:val="Code"/>
+        <w:ind w:left="2160"/>
+      </w:pPr>
+      <w:r>
+        <w:t xml:space="preserve">signal = </w:t>
+      </w:r>
+      <w:r>
+        <w:rPr>
+          <w:b/>
+          <w:bCs/>
+        </w:rPr>
+        <w:t>thread:getSignal()</w:t>
+      </w:r>
+    </w:p>
+    <w:p>
+      <w:pPr>
+        <w:pStyle w:val="Code"/>
+        <w:ind w:left="1440"/>
+      </w:pPr>
+      <w:r>
+        <w:t>end</w:t>
+      </w:r>
+    </w:p>
+    <w:p>
+      <w:pPr>
+        <w:pStyle w:val="Code"/>
+      </w:pPr>
+      <w:r>
+        <w:t>end</w:t>
+      </w:r>
+    </w:p>
+    <w:p>
+      <w:pPr>
+        <w:pStyle w:val="Code"/>
+        <w:rPr>
+          <w:b/>
+          <w:bCs/>
+        </w:rPr>
+      </w:pPr>
+      <w:r>
+        <w:t xml:space="preserve">local main_h, result = </w:t>
+      </w:r>
+      <w:r>
+        <w:rPr>
+          <w:b/>
+          <w:bCs/>
+        </w:rPr>
+        <w:t>thread:create</w:t>
+      </w:r>
+      <w:r>
+        <w:rPr>
+          <w:b/>
+          <w:bCs/>
+        </w:rPr>
+        <w:t>( yieldDuration, main )</w:t>
+      </w:r>
+    </w:p>
+    <w:p>
+      <w:pPr>
+        <w:pStyle w:val="Code"/>
+      </w:pPr>
+      <w:r>
+        <w:t>if main_h == nil then</w:t>
+      </w:r>
+    </w:p>
+    <w:p>
+      <w:pPr>
+        <w:pStyle w:val="Code"/>
+        <w:ind w:left="1440"/>
+      </w:pPr>
+      <w:r>
+        <w:rPr>
+          <w:b/>
+          <w:bCs/>
+        </w:rPr>
+        <w:t>mf:postResult</w:t>
+      </w:r>
+      <w:r>
+        <w:t>( result )</w:t>
+      </w:r>
+    </w:p>
+    <w:p>
+      <w:pPr>
+        <w:pStyle w:val="Code"/>
+      </w:pPr>
+      <w:r>
+        <w:t>end</w:t>
+      </w:r>
+    </w:p>
+    <w:p>
+      <w:pPr>
+        <w:pStyle w:val="Heading3"/>
+      </w:pPr>
+      <w:bookmarkStart w:id="42" w:name="_Toc71057182"/>
+      <w:r>
+        <w:t>Demo Application – A Simple Combat Log</w:t>
+      </w:r>
+      <w:bookmarkEnd w:id="42"/>
+    </w:p>
+    <w:p>
+      <w:pPr>
+        <w:pStyle w:val="Technical"/>
+      </w:pPr>
+      <w:r>
+        <w:t>This</w:t>
+      </w:r>
+      <w:r>
+        <w:t xml:space="preserve"> demo application is designed to illustrate </w:t>
+      </w:r>
+      <w:r>
+        <w:t>the produce</w:t>
+      </w:r>
+      <w:r>
+        <w:t>r</w:t>
+      </w:r>
+      <w:r>
+        <w:t>-consumer pattern using Talon threads in a working addon.</w:t>
+      </w:r>
+      <w:r>
+        <w:t xml:space="preserve"> In this example, the producer is that </w:t>
+      </w:r>
+      <w:r>
+        <w:rPr>
+          <w:i/>
+          <w:iCs/>
+        </w:rPr>
         <w:t>OnEvent()</w:t>
       </w:r>
       <w:r>
-        <w:t xml:space="preserve"> service. When the CLEU</w:t>
+        <w:t xml:space="preserve"> </w:t>
+      </w:r>
+      <w:r>
+        <w:lastRenderedPageBreak/>
+        <w:t>service. When the CLEU</w:t>
       </w:r>
       <w:r>
         <w:rPr>
           <w:rStyle w:val="FootnoteReference"/>
         </w:rPr>
-        <w:footnoteReference w:id="11"/>
+        <w:footnoteReference w:id="7"/>
       </w:r>
       <w:r>
         <w:t xml:space="preserve"> fires, the </w:t>
@@ -11994,155 +12465,155 @@
         <w:pStyle w:val="Code"/>
       </w:pPr>
       <w:r>
+        <w:t xml:space="preserve">  </w:t>
+      </w:r>
+      <w:r>
+        <w:t>local signal = SIG_NONE</w:t>
+      </w:r>
+    </w:p>
+    <w:p>
+      <w:pPr>
+        <w:pStyle w:val="Code"/>
+      </w:pPr>
+      <w:r>
+        <w:t xml:space="preserve">  </w:t>
+      </w:r>
+    </w:p>
+    <w:p>
+      <w:pPr>
+        <w:pStyle w:val="Code"/>
+      </w:pPr>
+      <w:r>
+        <w:t xml:space="preserve">  </w:t>
+      </w:r>
+      <w:r>
+        <w:t>while signal ~= SIG_RETURN do</w:t>
+      </w:r>
+    </w:p>
+    <w:p>
+      <w:pPr>
+        <w:pStyle w:val="Code"/>
+      </w:pPr>
+      <w:r>
+        <w:t xml:space="preserve">  </w:t>
+      </w:r>
+      <w:r>
+        <w:t>local logEntry = event:logEntryBufferRemove()</w:t>
+      </w:r>
+    </w:p>
+    <w:p>
+      <w:pPr>
+        <w:pStyle w:val="Code"/>
+      </w:pPr>
+      <w:r>
+        <w:t xml:space="preserve">  </w:t>
+      </w:r>
+      <w:r>
+        <w:t>if logEntry ~= nil then</w:t>
+      </w:r>
+    </w:p>
+    <w:p>
+      <w:pPr>
+        <w:pStyle w:val="Code"/>
+      </w:pPr>
+      <w:r>
+        <w:t xml:space="preserve">    </w:t>
+      </w:r>
+      <w:r>
+        <w:t>writeFloatingText( logEntry</w:t>
+      </w:r>
+      <w:r>
+        <w:t xml:space="preserve">  </w:t>
+      </w:r>
+      <w:r>
+        <w:t>)</w:t>
+      </w:r>
+    </w:p>
+    <w:p>
+      <w:pPr>
+        <w:pStyle w:val="Code"/>
+      </w:pPr>
+      <w:r>
+        <w:t xml:space="preserve">  </w:t>
+      </w:r>
+      <w:r>
+        <w:t>end</w:t>
+      </w:r>
+    </w:p>
+    <w:p>
+      <w:pPr>
+        <w:pStyle w:val="Code"/>
+      </w:pPr>
+      <w:r>
+        <w:t xml:space="preserve">  </w:t>
+      </w:r>
+      <w:r>
+        <w:t>thread:yield</w:t>
+      </w:r>
+      <w:r>
+        <w:t>()</w:t>
+      </w:r>
+    </w:p>
+    <w:p>
+      <w:pPr>
+        <w:pStyle w:val="Code"/>
+      </w:pPr>
+      <w:r>
+        <w:t xml:space="preserve">  </w:t>
+      </w:r>
+      <w:r>
+        <w:t xml:space="preserve">signal = </w:t>
+      </w:r>
+      <w:r>
+        <w:t>thread</w:t>
+      </w:r>
+      <w:r>
+        <w:t>:get</w:t>
+      </w:r>
+      <w:r>
+        <w:t>Signal</w:t>
+      </w:r>
+      <w:r>
+        <w:t>()</w:t>
+      </w:r>
+    </w:p>
+    <w:p>
+      <w:pPr>
+        <w:pStyle w:val="Code"/>
+      </w:pPr>
+      <w:r>
+        <w:t xml:space="preserve">  </w:t>
+      </w:r>
+      <w:r>
+        <w:t>end</w:t>
+      </w:r>
+    </w:p>
+    <w:p>
+      <w:pPr>
+        <w:pStyle w:val="Code"/>
+      </w:pPr>
+      <w:r>
+        <w:t xml:space="preserve">  </w:t>
+      </w:r>
+      <w:r>
+        <w:t>mf:postMsg( sprintf("publisher_h terminated.\n"))</w:t>
+      </w:r>
+    </w:p>
+    <w:p>
+      <w:pPr>
+        <w:pStyle w:val="Code"/>
+        <w:ind w:left="0" w:firstLine="720"/>
+      </w:pPr>
+      <w:r>
+        <w:t>end</w:t>
+      </w:r>
+    </w:p>
+    <w:p>
+      <w:pPr>
+        <w:pStyle w:val="Technical"/>
+      </w:pPr>
+      <w:r>
         <w:lastRenderedPageBreak/>
-        <w:t xml:space="preserve">  </w:t>
-      </w:r>
-      <w:r>
-        <w:t>local signal = SIG_NONE</w:t>
-      </w:r>
-    </w:p>
-    <w:p>
-      <w:pPr>
-        <w:pStyle w:val="Code"/>
-      </w:pPr>
-      <w:r>
-        <w:t xml:space="preserve">  </w:t>
-      </w:r>
-    </w:p>
-    <w:p>
-      <w:pPr>
-        <w:pStyle w:val="Code"/>
-      </w:pPr>
-      <w:r>
-        <w:t xml:space="preserve">  </w:t>
-      </w:r>
-      <w:r>
-        <w:t>while signal ~= SIG_RETURN do</w:t>
-      </w:r>
-    </w:p>
-    <w:p>
-      <w:pPr>
-        <w:pStyle w:val="Code"/>
-      </w:pPr>
-      <w:r>
-        <w:t xml:space="preserve">  </w:t>
-      </w:r>
-      <w:r>
-        <w:t>local logEntry = event:logEntryBufferRemove()</w:t>
-      </w:r>
-    </w:p>
-    <w:p>
-      <w:pPr>
-        <w:pStyle w:val="Code"/>
-      </w:pPr>
-      <w:r>
-        <w:t xml:space="preserve">  </w:t>
-      </w:r>
-      <w:r>
-        <w:t>if logEntry ~= nil then</w:t>
-      </w:r>
-    </w:p>
-    <w:p>
-      <w:pPr>
-        <w:pStyle w:val="Code"/>
-      </w:pPr>
-      <w:r>
-        <w:t xml:space="preserve">    </w:t>
-      </w:r>
-      <w:r>
-        <w:t>writeFloatingText( logEntry</w:t>
-      </w:r>
-      <w:r>
-        <w:t xml:space="preserve">  </w:t>
-      </w:r>
-      <w:r>
-        <w:t>)</w:t>
-      </w:r>
-    </w:p>
-    <w:p>
-      <w:pPr>
-        <w:pStyle w:val="Code"/>
-      </w:pPr>
-      <w:r>
-        <w:t xml:space="preserve">  </w:t>
-      </w:r>
-      <w:r>
-        <w:t>end</w:t>
-      </w:r>
-    </w:p>
-    <w:p>
-      <w:pPr>
-        <w:pStyle w:val="Code"/>
-      </w:pPr>
-      <w:r>
-        <w:t xml:space="preserve">  </w:t>
-      </w:r>
-      <w:r>
-        <w:t>thread:yield</w:t>
-      </w:r>
-      <w:r>
-        <w:t>()</w:t>
-      </w:r>
-    </w:p>
-    <w:p>
-      <w:pPr>
-        <w:pStyle w:val="Code"/>
-      </w:pPr>
-      <w:r>
-        <w:t xml:space="preserve">  </w:t>
-      </w:r>
-      <w:r>
-        <w:t xml:space="preserve">signal = </w:t>
-      </w:r>
-      <w:r>
-        <w:t>thread</w:t>
-      </w:r>
-      <w:r>
-        <w:t>:get</w:t>
-      </w:r>
-      <w:r>
-        <w:t>Signal</w:t>
-      </w:r>
-      <w:r>
-        <w:t>()</w:t>
-      </w:r>
-    </w:p>
-    <w:p>
-      <w:pPr>
-        <w:pStyle w:val="Code"/>
-      </w:pPr>
-      <w:r>
-        <w:t xml:space="preserve">  </w:t>
-      </w:r>
-      <w:r>
-        <w:t>end</w:t>
-      </w:r>
-    </w:p>
-    <w:p>
-      <w:pPr>
-        <w:pStyle w:val="Code"/>
-      </w:pPr>
-      <w:r>
-        <w:t xml:space="preserve">  </w:t>
-      </w:r>
-      <w:r>
-        <w:t>mf:postMsg( sprintf("publisher_h terminated.\n"))</w:t>
-      </w:r>
-    </w:p>
-    <w:p>
-      <w:pPr>
-        <w:pStyle w:val="Code"/>
-        <w:ind w:left="0" w:firstLine="720"/>
-      </w:pPr>
-      <w:r>
-        <w:t>end</w:t>
-      </w:r>
-    </w:p>
-    <w:p>
-      <w:pPr>
-        <w:pStyle w:val="Technical"/>
-      </w:pPr>
-      <w:r>
         <w:t xml:space="preserve">The function </w:t>
       </w:r>
       <w:r>
@@ -12365,80 +12836,80 @@
         <w:ind w:left="0"/>
       </w:pPr>
       <w:r>
+        <w:t xml:space="preserve">    </w:t>
+      </w:r>
+      <w:r>
+        <w:t xml:space="preserve">return </w:t>
+      </w:r>
+    </w:p>
+    <w:p>
+      <w:pPr>
+        <w:pStyle w:val="Code"/>
+        <w:ind w:left="0"/>
+      </w:pPr>
+      <w:r>
+        <w:t xml:space="preserve">  </w:t>
+      </w:r>
+      <w:r>
+        <w:t>end</w:t>
+      </w:r>
+    </w:p>
+    <w:p>
+      <w:pPr>
+        <w:pStyle w:val="Code"/>
+        <w:ind w:left="0"/>
+      </w:pPr>
+      <w:r>
+        <w:t xml:space="preserve">  </w:t>
+      </w:r>
+      <w:r>
+        <w:t>talonActive = true</w:t>
+      </w:r>
+    </w:p>
+    <w:p>
+      <w:pPr>
+        <w:pStyle w:val="Technical"/>
+      </w:pPr>
+      <w:r>
+        <w:t>When the main_h thread is created, its function is immediately executed and its only purpose is to create the publisher thread, publisher_h.</w:t>
+      </w:r>
+    </w:p>
+    <w:p>
+      <w:pPr>
+        <w:pStyle w:val="Code"/>
+      </w:pPr>
+      <w:r>
+        <w:t>local function main()</w:t>
+      </w:r>
+    </w:p>
+    <w:p>
+      <w:pPr>
+        <w:pStyle w:val="Code"/>
+        <w:ind w:left="0" w:firstLine="720"/>
+      </w:pPr>
+      <w:r>
+        <w:t>local result = {SUCCESS, nil, nil }</w:t>
+      </w:r>
+    </w:p>
+    <w:p>
+      <w:pPr>
+        <w:pStyle w:val="Code"/>
+      </w:pPr>
+    </w:p>
+    <w:p>
+      <w:pPr>
+        <w:pStyle w:val="Code"/>
+      </w:pPr>
+      <w:r>
+        <w:t>-- This sets the yield interval for the publisher_h thread to 8 ticks</w:t>
+      </w:r>
+    </w:p>
+    <w:p>
+      <w:pPr>
+        <w:pStyle w:val="Code"/>
+      </w:pPr>
+      <w:r>
         <w:lastRenderedPageBreak/>
-        <w:t xml:space="preserve">    </w:t>
-      </w:r>
-      <w:r>
-        <w:t xml:space="preserve">return </w:t>
-      </w:r>
-    </w:p>
-    <w:p>
-      <w:pPr>
-        <w:pStyle w:val="Code"/>
-        <w:ind w:left="0"/>
-      </w:pPr>
-      <w:r>
-        <w:t xml:space="preserve">  </w:t>
-      </w:r>
-      <w:r>
-        <w:t>end</w:t>
-      </w:r>
-    </w:p>
-    <w:p>
-      <w:pPr>
-        <w:pStyle w:val="Code"/>
-        <w:ind w:left="0"/>
-      </w:pPr>
-      <w:r>
-        <w:t xml:space="preserve">  </w:t>
-      </w:r>
-      <w:r>
-        <w:t>talonActive = true</w:t>
-      </w:r>
-    </w:p>
-    <w:p>
-      <w:pPr>
-        <w:pStyle w:val="Technical"/>
-      </w:pPr>
-      <w:r>
-        <w:t>When the main_h thread is created, its function is immediately executed and its only purpose is to create the publisher thread, publisher_h.</w:t>
-      </w:r>
-    </w:p>
-    <w:p>
-      <w:pPr>
-        <w:pStyle w:val="Code"/>
-      </w:pPr>
-      <w:r>
-        <w:t>local function main()</w:t>
-      </w:r>
-    </w:p>
-    <w:p>
-      <w:pPr>
-        <w:pStyle w:val="Code"/>
-        <w:ind w:left="0" w:firstLine="720"/>
-      </w:pPr>
-      <w:r>
-        <w:t>local result = {SUCCESS, nil, nil }</w:t>
-      </w:r>
-    </w:p>
-    <w:p>
-      <w:pPr>
-        <w:pStyle w:val="Code"/>
-      </w:pPr>
-    </w:p>
-    <w:p>
-      <w:pPr>
-        <w:pStyle w:val="Code"/>
-      </w:pPr>
-      <w:r>
-        <w:t>-- This sets the yield interval for the publisher_h thread to 8 ticks</w:t>
-      </w:r>
-    </w:p>
-    <w:p>
-      <w:pPr>
-        <w:pStyle w:val="Code"/>
-      </w:pPr>
-      <w:r>
         <w:t>-- of the Talon timer.</w:t>
       </w:r>
     </w:p>
@@ -12687,13 +13158,13 @@
       <w:pPr>
         <w:pStyle w:val="Heading1"/>
       </w:pPr>
-      <w:bookmarkStart w:id="44" w:name="_Ref70946386"/>
-      <w:bookmarkStart w:id="45" w:name="_Toc71057183"/>
+      <w:bookmarkStart w:id="43" w:name="_Ref70946386"/>
+      <w:bookmarkStart w:id="44" w:name="_Toc71057183"/>
       <w:r>
         <w:t>Threads In Perspective</w:t>
       </w:r>
+      <w:bookmarkEnd w:id="43"/>
       <w:bookmarkEnd w:id="44"/>
-      <w:bookmarkEnd w:id="45"/>
     </w:p>
     <w:p>
       <w:pPr>
@@ -12723,6 +13194,9 @@
     <w:p>
       <w:pPr>
         <w:pStyle w:val="Technical"/>
+        <w:rPr>
+          <w:rStyle w:val="Hyperlink"/>
+        </w:rPr>
       </w:pPr>
       <w:hyperlink r:id="rId9" w:history="1">
         <w:r>
@@ -12732,6 +13206,146 @@
           <w:t>The Problem with Threads</w:t>
         </w:r>
       </w:hyperlink>
+    </w:p>
+    <w:p>
+      <w:pPr>
+        <w:pStyle w:val="Heading1"/>
+      </w:pPr>
+      <w:bookmarkStart w:id="45" w:name="_Toc71057140"/>
+      <w:r>
+        <w:t>About the Author</w:t>
+      </w:r>
+      <w:bookmarkEnd w:id="45"/>
+    </w:p>
+    <w:p>
+      <w:pPr>
+        <w:pStyle w:val="Technical"/>
+      </w:pPr>
+      <w:r>
+        <w:t>I began playing World of Warcraft shortly after its first release (Vanilla) and have leveled at least 1 character to max in every expansion since.</w:t>
+      </w:r>
+    </w:p>
+    <w:p>
+      <w:pPr>
+        <w:pStyle w:val="Technical"/>
+      </w:pPr>
+      <w:r>
+        <w:t>I hold a PhD in a field completely unrelated to programming  (immunology) and as such confers absolutely no credibility insofar as programming is concerned. On the other hand, I am a retired software architect with the following experience:</w:t>
+      </w:r>
+    </w:p>
+    <w:p>
+      <w:pPr>
+        <w:pStyle w:val="Technical"/>
+        <w:numPr>
+          <w:ilvl w:val="0"/>
+          <w:numId w:val="22"/>
+        </w:numPr>
+      </w:pPr>
+      <w:r>
+        <w:t>Architect and Lead developer of Digital Equipment Corporation’s distributed UNIX-based off-line storage facility (Backup/Restore, Disaster Recovery, etc.,)</w:t>
+      </w:r>
+    </w:p>
+    <w:p>
+      <w:pPr>
+        <w:pStyle w:val="Technical"/>
+        <w:numPr>
+          <w:ilvl w:val="0"/>
+          <w:numId w:val="22"/>
+        </w:numPr>
+      </w:pPr>
+      <w:r>
+        <w:t>Lead developer and architect for the disaster recovery facility</w:t>
+      </w:r>
+      <w:r>
+        <w:rPr>
+          <w:rStyle w:val="FootnoteReference"/>
+        </w:rPr>
+        <w:footnoteReference w:id="8"/>
+      </w:r>
+      <w:r>
+        <w:t xml:space="preserve"> in the Windows NT operating system kernel.</w:t>
+      </w:r>
+    </w:p>
+    <w:p>
+      <w:pPr>
+        <w:pStyle w:val="Technical"/>
+        <w:numPr>
+          <w:ilvl w:val="0"/>
+          <w:numId w:val="22"/>
+        </w:numPr>
+      </w:pPr>
+      <w:r>
+        <w:t>Wrote the first POSIX threads implementation for Linux</w:t>
+      </w:r>
+      <w:r>
+        <w:rPr>
+          <w:rStyle w:val="FootnoteReference"/>
+        </w:rPr>
+        <w:footnoteReference w:id="9"/>
+      </w:r>
+      <w:r>
+        <w:t>.</w:t>
+      </w:r>
+    </w:p>
+    <w:p>
+      <w:pPr>
+        <w:pStyle w:val="Technical"/>
+        <w:numPr>
+          <w:ilvl w:val="0"/>
+          <w:numId w:val="22"/>
+        </w:numPr>
+      </w:pPr>
+      <w:r>
+        <w:lastRenderedPageBreak/>
+        <w:t xml:space="preserve">Author of </w:t>
+      </w:r>
+      <w:r>
+        <w:rPr>
+          <w:u w:val="single"/>
+        </w:rPr>
+        <w:t>DCE: A Guide To Developing Portable Applications</w:t>
+      </w:r>
+      <w:r>
+        <w:rPr>
+          <w:rStyle w:val="FootnoteReference"/>
+          <w:u w:val="single"/>
+        </w:rPr>
+        <w:footnoteReference w:id="10"/>
+      </w:r>
+      <w:r>
+        <w:t>. This book evolved, in part, from my association with the development of Digital’s Concert Multithread Architecture (CMA)</w:t>
+      </w:r>
+      <w:r>
+        <w:rPr>
+          <w:rStyle w:val="FootnoteReference"/>
+        </w:rPr>
+        <w:footnoteReference w:id="11"/>
+      </w:r>
+      <w:r>
+        <w:t>. CMA, and especially its lead developer, David Butenof. David was a formative influence on the development of POSIX threads</w:t>
+      </w:r>
+      <w:r>
+        <w:rPr>
+          <w:rStyle w:val="FootnoteReference"/>
+        </w:rPr>
+        <w:footnoteReference w:id="12"/>
+      </w:r>
+      <w:r>
+        <w:t>.</w:t>
+      </w:r>
+    </w:p>
+    <w:p>
+      <w:pPr>
+        <w:pStyle w:val="Technical"/>
+      </w:pPr>
+      <w:r>
+        <w:t>As inferred earlier, one of the reasons I wrote a threads library for WoW addon development arises from what I believe is a good deal of confusion about threads – what they are and their good, bad, and ugly aspects. So, let’s dive into these muddy waters and see if we can get a clearer understanding along with some perspective as to how multithreading a WoW addon might be just the thing your addon needs, but probably isn’t.</w:t>
+      </w:r>
+    </w:p>
+    <w:p>
+      <w:pPr>
+        <w:pStyle w:val="Technical"/>
+      </w:pPr>
     </w:p>
     <w:p>
       <w:pPr>
@@ -12901,7 +13515,7 @@
         <w:footnoteRef/>
       </w:r>
       <w:r>
-        <w:t xml:space="preserve"> Formally known as ASR (Automated System Recovery)</w:t>
+        <w:t xml:space="preserve"> Unity uses coroutines and is also a component of approximately ½ of all mobile games in the market today.</w:t>
       </w:r>
     </w:p>
   </w:footnote>
@@ -12917,7 +13531,7 @@
         <w:footnoteRef/>
       </w:r>
       <w:r>
-        <w:t xml:space="preserve"> These were user-mode, preemptive threads.</w:t>
+        <w:t xml:space="preserve"> Thread preemption requires explicit hardware support in order to assign threads to specific processors or cores. Most modern operating system have kernel services that are able to trigger the hardware primitives that mediate processor assignment. </w:t>
       </w:r>
     </w:p>
   </w:footnote>
@@ -12933,7 +13547,7 @@
         <w:footnoteRef/>
       </w:r>
       <w:r>
-        <w:t xml:space="preserve"> Peterson, Michael T., DCE: A Guide To Developing Portable Applications, McGraw-Hill, 1995</w:t>
+        <w:t xml:space="preserve"> In the formal sense: code complexity is often measured in terms of the McCabe Complexity Metric (also called Cyclomatic Complexity) and is a measure of the linearly independent code paths through a program’s source code.</w:t>
       </w:r>
     </w:p>
   </w:footnote>
@@ -12949,10 +13563,41 @@
         <w:footnoteRef/>
       </w:r>
       <w:r>
-        <w:t xml:space="preserve"> He was the author of one of the early Bibles of POSIX threads. You can click this link for further information: </w:t>
-      </w:r>
-      <w:r>
-        <w:t>https://www.amazon.com/Programming-POSIX-Threads-David-Butenhof/dp/0201633922</w:t>
+        <w:t xml:space="preserve"> I come from a C</w:t>
+      </w:r>
+      <w:r>
+        <w:t xml:space="preserve">/C++ background and the </w:t>
+      </w:r>
+      <w:r>
+        <w:t xml:space="preserve">use of </w:t>
+      </w:r>
+      <w:r>
+        <w:rPr>
+          <w:i/>
+          <w:iCs/>
+        </w:rPr>
+        <w:t>main()</w:t>
+      </w:r>
+      <w:r>
+        <w:t xml:space="preserve"> seemed appropriate. </w:t>
+      </w:r>
+      <w:r>
+        <w:t xml:space="preserve">However, </w:t>
+      </w:r>
+      <w:r>
+        <w:t xml:space="preserve">Talon doesn’t care. You can </w:t>
+      </w:r>
+      <w:r>
+        <w:t xml:space="preserve">name </w:t>
+      </w:r>
+      <w:r>
+        <w:t xml:space="preserve">such functions </w:t>
+      </w:r>
+      <w:r>
+        <w:t>anything</w:t>
+      </w:r>
+      <w:r>
+        <w:t xml:space="preserve"> you want.</w:t>
       </w:r>
     </w:p>
   </w:footnote>
@@ -12968,7 +13613,23 @@
         <w:footnoteRef/>
       </w:r>
       <w:r>
-        <w:t xml:space="preserve"> Unity uses coroutines and is also a component of approximately ½ of all mobile games in the market today.</w:t>
+        <w:t xml:space="preserve"> i.e., 1/</w:t>
+      </w:r>
+      <w:r>
+        <w:rPr>
+          <w:i/>
+          <w:iCs/>
+        </w:rPr>
+        <w:t>GetFramerate()</w:t>
+      </w:r>
+      <w:r>
+        <w:t xml:space="preserve">. </w:t>
+      </w:r>
+      <w:r>
+        <w:t>For a framerate of 60 FPS, this gives a tick interval of 0.0167 seconds</w:t>
+      </w:r>
+      <w:r>
+        <w:t>, or about 17 ms.</w:t>
       </w:r>
     </w:p>
   </w:footnote>
@@ -12984,7 +13645,10 @@
         <w:footnoteRef/>
       </w:r>
       <w:r>
-        <w:t xml:space="preserve"> Thread preemption requires explicit hardware support in order to assign threads to specific processors or cores. Most modern operating system have kernel services that are able to trigger the hardware primitives that mediate processor assignment. </w:t>
+        <w:t xml:space="preserve"> For example, a thread waiting on an event, could use the SIG_WAKEUP signal to notify a logging thread that an event record is ready for logging. </w:t>
+      </w:r>
+      <w:r>
+        <w:t xml:space="preserve"> SIG_WAKEUP is used because the dispatcher will immediately submit the signaled thread to the run queue despite its remaining tick count.</w:t>
       </w:r>
     </w:p>
   </w:footnote>
@@ -13000,7 +13664,7 @@
         <w:footnoteRef/>
       </w:r>
       <w:r>
-        <w:t xml:space="preserve"> In the formal sense: code complexity is often measured in terms of the McCabe Complexity Metric (also called Cyclomatic Complexity) and is a measure of the linearly independent code paths through a program’s source code.</w:t>
+        <w:t xml:space="preserve"> COMBAT_LOG_EVENT_UNFILTERED</w:t>
       </w:r>
     </w:p>
   </w:footnote>
@@ -13016,41 +13680,7 @@
         <w:footnoteRef/>
       </w:r>
       <w:r>
-        <w:t xml:space="preserve"> I come from a C</w:t>
-      </w:r>
-      <w:r>
-        <w:t xml:space="preserve">/C++ background and the </w:t>
-      </w:r>
-      <w:r>
-        <w:t xml:space="preserve">use of </w:t>
-      </w:r>
-      <w:r>
-        <w:rPr>
-          <w:i/>
-          <w:iCs/>
-        </w:rPr>
-        <w:t>main()</w:t>
-      </w:r>
-      <w:r>
-        <w:t xml:space="preserve"> seemed appropriate. </w:t>
-      </w:r>
-      <w:r>
-        <w:t xml:space="preserve">However, </w:t>
-      </w:r>
-      <w:r>
-        <w:t xml:space="preserve">Talon doesn’t care. You can </w:t>
-      </w:r>
-      <w:r>
-        <w:t xml:space="preserve">name </w:t>
-      </w:r>
-      <w:r>
-        <w:t xml:space="preserve">such functions </w:t>
-      </w:r>
-      <w:r>
-        <w:t>anything</w:t>
-      </w:r>
-      <w:r>
-        <w:t xml:space="preserve"> you want.</w:t>
+        <w:t xml:space="preserve"> Formally known as ASR (Automated System Recovery)</w:t>
       </w:r>
     </w:p>
   </w:footnote>
@@ -13066,23 +13696,7 @@
         <w:footnoteRef/>
       </w:r>
       <w:r>
-        <w:t xml:space="preserve"> i.e., 1/</w:t>
-      </w:r>
-      <w:r>
-        <w:rPr>
-          <w:i/>
-          <w:iCs/>
-        </w:rPr>
-        <w:t>GetFramerate()</w:t>
-      </w:r>
-      <w:r>
-        <w:t xml:space="preserve">. </w:t>
-      </w:r>
-      <w:r>
-        <w:t>For a framerate of 60 FPS, this gives a tick interval of 0.0167 seconds</w:t>
-      </w:r>
-      <w:r>
-        <w:t>, or about 17 ms.</w:t>
+        <w:t xml:space="preserve"> These were user-mode, preemptive threads.</w:t>
       </w:r>
     </w:p>
   </w:footnote>
@@ -13098,10 +13712,7 @@
         <w:footnoteRef/>
       </w:r>
       <w:r>
-        <w:t xml:space="preserve"> For example, a thread waiting on an event, could use the SIG_WAKEUP signal to notify a logging thread that an event record is ready for logging. </w:t>
-      </w:r>
-      <w:r>
-        <w:t xml:space="preserve"> SIG_WAKEUP is used because the dispatcher will immediately submit the signaled thread to the run queue despite its remaining tick count.</w:t>
+        <w:t xml:space="preserve"> Peterson, Michael T., DCE: A Guide To Developing Portable Applications, McGraw-Hill, 1995</w:t>
       </w:r>
     </w:p>
   </w:footnote>
@@ -13117,7 +13728,26 @@
         <w:footnoteRef/>
       </w:r>
       <w:r>
-        <w:t xml:space="preserve"> COMBAT_LOG_EVENT_UNFILTERED</w:t>
+        <w:t xml:space="preserve"> A precurser model to the POSIX standard threads library.</w:t>
+      </w:r>
+    </w:p>
+  </w:footnote>
+  <w:footnote w:id="12">
+    <w:p>
+      <w:pPr>
+        <w:pStyle w:val="FootnoteText"/>
+      </w:pPr>
+      <w:r>
+        <w:rPr>
+          <w:rStyle w:val="FootnoteReference"/>
+        </w:rPr>
+        <w:footnoteRef/>
+      </w:r>
+      <w:r>
+        <w:t xml:space="preserve"> He was the author of one of the early Bibles of POSIX threads. You can click this link for further information: </w:t>
+      </w:r>
+      <w:r>
+        <w:t>https://www.amazon.com/Programming-POSIX-Threads-David-Butenhof/dp/0201633922</w:t>
       </w:r>
     </w:p>
   </w:footnote>
@@ -15068,6 +15698,95 @@
     </w:lvl>
   </w:abstractNum>
   <w:abstractNum w:abstractNumId="19" w15:restartNumberingAfterBreak="0">
+    <w:nsid w:val="412F6D97"/>
+    <w:multiLevelType w:val="hybridMultilevel"/>
+    <w:tmpl w:val="BF7A2B00"/>
+    <w:lvl w:ilvl="0" w:tplc="0409000F">
+      <w:start w:val="1"/>
+      <w:numFmt w:val="decimal"/>
+      <w:lvlText w:val="%1."/>
+      <w:lvlJc w:val="left"/>
+      <w:pPr>
+        <w:ind w:left="720" w:hanging="360"/>
+      </w:pPr>
+      <w:rPr>
+        <w:rFonts w:hint="default"/>
+      </w:rPr>
+    </w:lvl>
+    <w:lvl w:ilvl="1" w:tplc="04090019" w:tentative="1">
+      <w:start w:val="1"/>
+      <w:numFmt w:val="lowerLetter"/>
+      <w:lvlText w:val="%2."/>
+      <w:lvlJc w:val="left"/>
+      <w:pPr>
+        <w:ind w:left="1440" w:hanging="360"/>
+      </w:pPr>
+    </w:lvl>
+    <w:lvl w:ilvl="2" w:tplc="0409001B" w:tentative="1">
+      <w:start w:val="1"/>
+      <w:numFmt w:val="lowerRoman"/>
+      <w:lvlText w:val="%3."/>
+      <w:lvlJc w:val="right"/>
+      <w:pPr>
+        <w:ind w:left="2160" w:hanging="180"/>
+      </w:pPr>
+    </w:lvl>
+    <w:lvl w:ilvl="3" w:tplc="0409000F" w:tentative="1">
+      <w:start w:val="1"/>
+      <w:numFmt w:val="decimal"/>
+      <w:lvlText w:val="%4."/>
+      <w:lvlJc w:val="left"/>
+      <w:pPr>
+        <w:ind w:left="2880" w:hanging="360"/>
+      </w:pPr>
+    </w:lvl>
+    <w:lvl w:ilvl="4" w:tplc="04090019" w:tentative="1">
+      <w:start w:val="1"/>
+      <w:numFmt w:val="lowerLetter"/>
+      <w:lvlText w:val="%5."/>
+      <w:lvlJc w:val="left"/>
+      <w:pPr>
+        <w:ind w:left="3600" w:hanging="360"/>
+      </w:pPr>
+    </w:lvl>
+    <w:lvl w:ilvl="5" w:tplc="0409001B" w:tentative="1">
+      <w:start w:val="1"/>
+      <w:numFmt w:val="lowerRoman"/>
+      <w:lvlText w:val="%6."/>
+      <w:lvlJc w:val="right"/>
+      <w:pPr>
+        <w:ind w:left="4320" w:hanging="180"/>
+      </w:pPr>
+    </w:lvl>
+    <w:lvl w:ilvl="6" w:tplc="0409000F" w:tentative="1">
+      <w:start w:val="1"/>
+      <w:numFmt w:val="decimal"/>
+      <w:lvlText w:val="%7."/>
+      <w:lvlJc w:val="left"/>
+      <w:pPr>
+        <w:ind w:left="5040" w:hanging="360"/>
+      </w:pPr>
+    </w:lvl>
+    <w:lvl w:ilvl="7" w:tplc="04090019" w:tentative="1">
+      <w:start w:val="1"/>
+      <w:numFmt w:val="lowerLetter"/>
+      <w:lvlText w:val="%8."/>
+      <w:lvlJc w:val="left"/>
+      <w:pPr>
+        <w:ind w:left="5760" w:hanging="360"/>
+      </w:pPr>
+    </w:lvl>
+    <w:lvl w:ilvl="8" w:tplc="0409001B" w:tentative="1">
+      <w:start w:val="1"/>
+      <w:numFmt w:val="lowerRoman"/>
+      <w:lvlText w:val="%9."/>
+      <w:lvlJc w:val="right"/>
+      <w:pPr>
+        <w:ind w:left="6480" w:hanging="180"/>
+      </w:pPr>
+    </w:lvl>
+  </w:abstractNum>
+  <w:abstractNum w:abstractNumId="20" w15:restartNumberingAfterBreak="0">
     <w:nsid w:val="41D41C29"/>
     <w:multiLevelType w:val="hybridMultilevel"/>
     <w:tmpl w:val="EF3C6044"/>
@@ -15156,7 +15875,7 @@
       </w:pPr>
     </w:lvl>
   </w:abstractNum>
-  <w:abstractNum w:abstractNumId="20" w15:restartNumberingAfterBreak="0">
+  <w:abstractNum w:abstractNumId="21" w15:restartNumberingAfterBreak="0">
     <w:nsid w:val="42DB0233"/>
     <w:multiLevelType w:val="hybridMultilevel"/>
     <w:tmpl w:val="00E81520"/>
@@ -15242,7 +15961,7 @@
       </w:pPr>
     </w:lvl>
   </w:abstractNum>
-  <w:abstractNum w:abstractNumId="21" w15:restartNumberingAfterBreak="0">
+  <w:abstractNum w:abstractNumId="22" w15:restartNumberingAfterBreak="0">
     <w:nsid w:val="444547EC"/>
     <w:multiLevelType w:val="hybridMultilevel"/>
     <w:tmpl w:val="B6A42498"/>
@@ -15331,7 +16050,7 @@
       </w:pPr>
     </w:lvl>
   </w:abstractNum>
-  <w:abstractNum w:abstractNumId="22" w15:restartNumberingAfterBreak="0">
+  <w:abstractNum w:abstractNumId="23" w15:restartNumberingAfterBreak="0">
     <w:nsid w:val="45DA0A24"/>
     <w:multiLevelType w:val="hybridMultilevel"/>
     <w:tmpl w:val="7DBACC4E"/>
@@ -15444,7 +16163,7 @@
       </w:rPr>
     </w:lvl>
   </w:abstractNum>
-  <w:abstractNum w:abstractNumId="23" w15:restartNumberingAfterBreak="0">
+  <w:abstractNum w:abstractNumId="24" w15:restartNumberingAfterBreak="0">
     <w:nsid w:val="47BF3D7C"/>
     <w:multiLevelType w:val="hybridMultilevel"/>
     <w:tmpl w:val="EBF22A46"/>
@@ -15557,7 +16276,7 @@
       </w:rPr>
     </w:lvl>
   </w:abstractNum>
-  <w:abstractNum w:abstractNumId="24" w15:restartNumberingAfterBreak="0">
+  <w:abstractNum w:abstractNumId="25" w15:restartNumberingAfterBreak="0">
     <w:nsid w:val="4DA9186E"/>
     <w:multiLevelType w:val="hybridMultilevel"/>
     <w:tmpl w:val="F8686816"/>
@@ -15643,7 +16362,7 @@
       </w:pPr>
     </w:lvl>
   </w:abstractNum>
-  <w:abstractNum w:abstractNumId="25" w15:restartNumberingAfterBreak="0">
+  <w:abstractNum w:abstractNumId="26" w15:restartNumberingAfterBreak="0">
     <w:nsid w:val="50F10221"/>
     <w:multiLevelType w:val="hybridMultilevel"/>
     <w:tmpl w:val="9B64FAA8"/>
@@ -15729,7 +16448,7 @@
       </w:pPr>
     </w:lvl>
   </w:abstractNum>
-  <w:abstractNum w:abstractNumId="26" w15:restartNumberingAfterBreak="0">
+  <w:abstractNum w:abstractNumId="27" w15:restartNumberingAfterBreak="0">
     <w:nsid w:val="51B70D5E"/>
     <w:multiLevelType w:val="hybridMultilevel"/>
     <w:tmpl w:val="FB42D7C6"/>
@@ -15841,7 +16560,7 @@
       </w:rPr>
     </w:lvl>
   </w:abstractNum>
-  <w:abstractNum w:abstractNumId="27" w15:restartNumberingAfterBreak="0">
+  <w:abstractNum w:abstractNumId="28" w15:restartNumberingAfterBreak="0">
     <w:nsid w:val="53977CBC"/>
     <w:multiLevelType w:val="hybridMultilevel"/>
     <w:tmpl w:val="0FA81702"/>
@@ -15927,7 +16646,7 @@
       </w:pPr>
     </w:lvl>
   </w:abstractNum>
-  <w:abstractNum w:abstractNumId="28" w15:restartNumberingAfterBreak="0">
+  <w:abstractNum w:abstractNumId="29" w15:restartNumberingAfterBreak="0">
     <w:nsid w:val="589E7BB1"/>
     <w:multiLevelType w:val="hybridMultilevel"/>
     <w:tmpl w:val="4A88B712"/>
@@ -16016,7 +16735,7 @@
       </w:pPr>
     </w:lvl>
   </w:abstractNum>
-  <w:abstractNum w:abstractNumId="29" w15:restartNumberingAfterBreak="0">
+  <w:abstractNum w:abstractNumId="30" w15:restartNumberingAfterBreak="0">
     <w:nsid w:val="6FBA1456"/>
     <w:multiLevelType w:val="hybridMultilevel"/>
     <w:tmpl w:val="47805EF4"/>
@@ -16129,7 +16848,7 @@
       </w:rPr>
     </w:lvl>
   </w:abstractNum>
-  <w:abstractNum w:abstractNumId="30" w15:restartNumberingAfterBreak="0">
+  <w:abstractNum w:abstractNumId="31" w15:restartNumberingAfterBreak="0">
     <w:nsid w:val="731D7C4A"/>
     <w:multiLevelType w:val="hybridMultilevel"/>
     <w:tmpl w:val="86EA6952"/>
@@ -16243,7 +16962,7 @@
       </w:rPr>
     </w:lvl>
   </w:abstractNum>
-  <w:abstractNum w:abstractNumId="31" w15:restartNumberingAfterBreak="0">
+  <w:abstractNum w:abstractNumId="32" w15:restartNumberingAfterBreak="0">
     <w:nsid w:val="7338029D"/>
     <w:multiLevelType w:val="hybridMultilevel"/>
     <w:tmpl w:val="594A034C"/>
@@ -16355,7 +17074,7 @@
       </w:rPr>
     </w:lvl>
   </w:abstractNum>
-  <w:abstractNum w:abstractNumId="32" w15:restartNumberingAfterBreak="0">
+  <w:abstractNum w:abstractNumId="33" w15:restartNumberingAfterBreak="0">
     <w:nsid w:val="754121A5"/>
     <w:multiLevelType w:val="hybridMultilevel"/>
     <w:tmpl w:val="F5067D1A"/>
@@ -16468,7 +17187,7 @@
       </w:rPr>
     </w:lvl>
   </w:abstractNum>
-  <w:abstractNum w:abstractNumId="33" w15:restartNumberingAfterBreak="0">
+  <w:abstractNum w:abstractNumId="34" w15:restartNumberingAfterBreak="0">
     <w:nsid w:val="7F257DBE"/>
     <w:multiLevelType w:val="hybridMultilevel"/>
     <w:tmpl w:val="E65A89D8"/>
@@ -16570,28 +17289,28 @@
     <w:abstractNumId w:val="14"/>
   </w:num>
   <w:num w:numId="5">
-    <w:abstractNumId w:val="19"/>
+    <w:abstractNumId w:val="20"/>
   </w:num>
   <w:num w:numId="6">
-    <w:abstractNumId w:val="33"/>
+    <w:abstractNumId w:val="34"/>
   </w:num>
   <w:num w:numId="7">
-    <w:abstractNumId w:val="24"/>
+    <w:abstractNumId w:val="25"/>
   </w:num>
   <w:num w:numId="8">
     <w:abstractNumId w:val="17"/>
   </w:num>
   <w:num w:numId="9">
-    <w:abstractNumId w:val="21"/>
+    <w:abstractNumId w:val="22"/>
   </w:num>
   <w:num w:numId="10">
-    <w:abstractNumId w:val="22"/>
+    <w:abstractNumId w:val="23"/>
   </w:num>
   <w:num w:numId="11">
-    <w:abstractNumId w:val="29"/>
+    <w:abstractNumId w:val="30"/>
   </w:num>
   <w:num w:numId="12">
-    <w:abstractNumId w:val="23"/>
+    <w:abstractNumId w:val="24"/>
   </w:num>
   <w:num w:numId="13">
     <w:abstractNumId w:val="4"/>
@@ -16609,7 +17328,7 @@
     <w:abstractNumId w:val="7"/>
   </w:num>
   <w:num w:numId="18">
-    <w:abstractNumId w:val="20"/>
+    <w:abstractNumId w:val="21"/>
   </w:num>
   <w:num w:numId="19">
     <w:abstractNumId w:val="10"/>
@@ -16621,7 +17340,7 @@
     <w:abstractNumId w:val="1"/>
   </w:num>
   <w:num w:numId="22">
-    <w:abstractNumId w:val="32"/>
+    <w:abstractNumId w:val="33"/>
   </w:num>
   <w:num w:numId="23">
     <w:abstractNumId w:val="9"/>
@@ -16630,7 +17349,7 @@
     <w:abstractNumId w:val="15"/>
   </w:num>
   <w:num w:numId="25">
-    <w:abstractNumId w:val="25"/>
+    <w:abstractNumId w:val="26"/>
   </w:num>
   <w:num w:numId="26">
     <w:abstractNumId w:val="2"/>
@@ -16639,13 +17358,13 @@
     <w:abstractNumId w:val="13"/>
   </w:num>
   <w:num w:numId="28">
-    <w:abstractNumId w:val="26"/>
+    <w:abstractNumId w:val="27"/>
   </w:num>
   <w:num w:numId="29">
-    <w:abstractNumId w:val="31"/>
+    <w:abstractNumId w:val="32"/>
   </w:num>
   <w:num w:numId="30">
-    <w:abstractNumId w:val="27"/>
+    <w:abstractNumId w:val="28"/>
   </w:num>
   <w:num w:numId="31">
     <w:abstractNumId w:val="8"/>
@@ -16654,10 +17373,13 @@
     <w:abstractNumId w:val="0"/>
   </w:num>
   <w:num w:numId="33">
-    <w:abstractNumId w:val="28"/>
+    <w:abstractNumId w:val="29"/>
   </w:num>
   <w:num w:numId="34">
-    <w:abstractNumId w:val="30"/>
+    <w:abstractNumId w:val="31"/>
+  </w:num>
+  <w:num w:numId="35">
+    <w:abstractNumId w:val="19"/>
   </w:num>
 </w:numbering>
 </file>
@@ -17150,6 +17872,7 @@
   <w:style w:type="character" w:default="1" w:styleId="DefaultParagraphFont">
     <w:name w:val="Default Paragraph Font"/>
     <w:uiPriority w:val="1"/>
+    <w:semiHidden/>
     <w:unhideWhenUsed/>
   </w:style>
   <w:style w:type="table" w:default="1" w:styleId="TableNormal">

</xml_diff>

<commit_message>
Deleted a url reference that was no longer relevant.
</commit_message>
<xml_diff>
--- a/Docs/WoW Thread Library.docx
+++ b/Docs/WoW Thread Library.docx
@@ -607,7 +607,7 @@
                 <w:noProof/>
                 <w:webHidden/>
               </w:rPr>
-              <w:t>6</w:t>
+              <w:t>30</w:t>
             </w:r>
             <w:r>
               <w:rPr>
@@ -677,7 +677,7 @@
                 <w:noProof/>
                 <w:webHidden/>
               </w:rPr>
-              <w:t>7</w:t>
+              <w:t>6</w:t>
             </w:r>
             <w:r>
               <w:rPr>
@@ -747,7 +747,7 @@
                 <w:noProof/>
                 <w:webHidden/>
               </w:rPr>
-              <w:t>7</w:t>
+              <w:t>6</w:t>
             </w:r>
             <w:r>
               <w:rPr>
@@ -817,7 +817,7 @@
                 <w:noProof/>
                 <w:webHidden/>
               </w:rPr>
-              <w:t>9</w:t>
+              <w:t>8</w:t>
             </w:r>
             <w:r>
               <w:rPr>
@@ -887,7 +887,7 @@
                 <w:noProof/>
                 <w:webHidden/>
               </w:rPr>
-              <w:t>10</w:t>
+              <w:t>9</w:t>
             </w:r>
             <w:r>
               <w:rPr>
@@ -957,7 +957,7 @@
                 <w:noProof/>
                 <w:webHidden/>
               </w:rPr>
-              <w:t>11</w:t>
+              <w:t>10</w:t>
             </w:r>
             <w:r>
               <w:rPr>
@@ -1027,7 +1027,7 @@
                 <w:noProof/>
                 <w:webHidden/>
               </w:rPr>
-              <w:t>11</w:t>
+              <w:t>10</w:t>
             </w:r>
             <w:r>
               <w:rPr>
@@ -1097,7 +1097,7 @@
                 <w:noProof/>
                 <w:webHidden/>
               </w:rPr>
-              <w:t>12</w:t>
+              <w:t>11</w:t>
             </w:r>
             <w:r>
               <w:rPr>
@@ -1167,7 +1167,7 @@
                 <w:noProof/>
                 <w:webHidden/>
               </w:rPr>
-              <w:t>12</w:t>
+              <w:t>11</w:t>
             </w:r>
             <w:r>
               <w:rPr>
@@ -1237,7 +1237,7 @@
                 <w:noProof/>
                 <w:webHidden/>
               </w:rPr>
-              <w:t>12</w:t>
+              <w:t>11</w:t>
             </w:r>
             <w:r>
               <w:rPr>
@@ -1307,7 +1307,7 @@
                 <w:noProof/>
                 <w:webHidden/>
               </w:rPr>
-              <w:t>13</w:t>
+              <w:t>12</w:t>
             </w:r>
             <w:r>
               <w:rPr>
@@ -1447,7 +1447,7 @@
                 <w:noProof/>
                 <w:webHidden/>
               </w:rPr>
-              <w:t>15</w:t>
+              <w:t>14</w:t>
             </w:r>
             <w:r>
               <w:rPr>
@@ -1517,7 +1517,7 @@
                 <w:noProof/>
                 <w:webHidden/>
               </w:rPr>
-              <w:t>15</w:t>
+              <w:t>14</w:t>
             </w:r>
             <w:r>
               <w:rPr>
@@ -1657,7 +1657,7 @@
                 <w:noProof/>
                 <w:webHidden/>
               </w:rPr>
-              <w:t>16</w:t>
+              <w:t>15</w:t>
             </w:r>
             <w:r>
               <w:rPr>
@@ -1797,7 +1797,7 @@
                 <w:noProof/>
                 <w:webHidden/>
               </w:rPr>
-              <w:t>17</w:t>
+              <w:t>16</w:t>
             </w:r>
             <w:r>
               <w:rPr>
@@ -1867,7 +1867,7 @@
                 <w:noProof/>
                 <w:webHidden/>
               </w:rPr>
-              <w:t>17</w:t>
+              <w:t>16</w:t>
             </w:r>
             <w:r>
               <w:rPr>
@@ -1937,7 +1937,7 @@
                 <w:noProof/>
                 <w:webHidden/>
               </w:rPr>
-              <w:t>17</w:t>
+              <w:t>16</w:t>
             </w:r>
             <w:r>
               <w:rPr>
@@ -2007,7 +2007,7 @@
                 <w:noProof/>
                 <w:webHidden/>
               </w:rPr>
-              <w:t>18</w:t>
+              <w:t>17</w:t>
             </w:r>
             <w:r>
               <w:rPr>
@@ -2077,7 +2077,7 @@
                 <w:noProof/>
                 <w:webHidden/>
               </w:rPr>
-              <w:t>18</w:t>
+              <w:t>17</w:t>
             </w:r>
             <w:r>
               <w:rPr>
@@ -2217,7 +2217,7 @@
                 <w:noProof/>
                 <w:webHidden/>
               </w:rPr>
-              <w:t>19</w:t>
+              <w:t>18</w:t>
             </w:r>
             <w:r>
               <w:rPr>
@@ -2287,7 +2287,7 @@
                 <w:noProof/>
                 <w:webHidden/>
               </w:rPr>
-              <w:t>19</w:t>
+              <w:t>18</w:t>
             </w:r>
             <w:r>
               <w:rPr>
@@ -2357,7 +2357,7 @@
                 <w:noProof/>
                 <w:webHidden/>
               </w:rPr>
-              <w:t>20</w:t>
+              <w:t>19</w:t>
             </w:r>
             <w:r>
               <w:rPr>
@@ -2427,7 +2427,7 @@
                 <w:noProof/>
                 <w:webHidden/>
               </w:rPr>
-              <w:t>21</w:t>
+              <w:t>20</w:t>
             </w:r>
             <w:r>
               <w:rPr>
@@ -2497,7 +2497,7 @@
                 <w:noProof/>
                 <w:webHidden/>
               </w:rPr>
-              <w:t>22</w:t>
+              <w:t>21</w:t>
             </w:r>
             <w:r>
               <w:rPr>
@@ -2567,7 +2567,7 @@
                 <w:noProof/>
                 <w:webHidden/>
               </w:rPr>
-              <w:t>22</w:t>
+              <w:t>21</w:t>
             </w:r>
             <w:r>
               <w:rPr>
@@ -2707,7 +2707,7 @@
                 <w:noProof/>
                 <w:webHidden/>
               </w:rPr>
-              <w:t>23</w:t>
+              <w:t>22</w:t>
             </w:r>
             <w:r>
               <w:rPr>
@@ -2777,7 +2777,7 @@
                 <w:noProof/>
                 <w:webHidden/>
               </w:rPr>
-              <w:t>23</w:t>
+              <w:t>22</w:t>
             </w:r>
             <w:r>
               <w:rPr>
@@ -2917,7 +2917,7 @@
                 <w:noProof/>
                 <w:webHidden/>
               </w:rPr>
-              <w:t>24</w:t>
+              <w:t>23</w:t>
             </w:r>
             <w:r>
               <w:rPr>
@@ -2987,7 +2987,7 @@
                 <w:noProof/>
                 <w:webHidden/>
               </w:rPr>
-              <w:t>24</w:t>
+              <w:t>23</w:t>
             </w:r>
             <w:r>
               <w:rPr>
@@ -3127,7 +3127,7 @@
                 <w:noProof/>
                 <w:webHidden/>
               </w:rPr>
-              <w:t>25</w:t>
+              <w:t>24</w:t>
             </w:r>
             <w:r>
               <w:rPr>
@@ -3407,7 +3407,7 @@
                 <w:noProof/>
                 <w:webHidden/>
               </w:rPr>
-              <w:t>26</w:t>
+              <w:t>25</w:t>
             </w:r>
             <w:r>
               <w:rPr>
@@ -3477,7 +3477,7 @@
                 <w:noProof/>
                 <w:webHidden/>
               </w:rPr>
-              <w:t>27</w:t>
+              <w:t>26</w:t>
             </w:r>
             <w:r>
               <w:rPr>
@@ -3547,7 +3547,7 @@
                 <w:noProof/>
                 <w:webHidden/>
               </w:rPr>
-              <w:t>27</w:t>
+              <w:t>28</w:t>
             </w:r>
             <w:r>
               <w:rPr>
@@ -3617,7 +3617,7 @@
                 <w:noProof/>
                 <w:webHidden/>
               </w:rPr>
-              <w:t>29</w:t>
+              <w:t>30</w:t>
             </w:r>
             <w:r>
               <w:rPr>
@@ -11320,6 +11320,7 @@
         <w:pStyle w:val="Code"/>
       </w:pPr>
       <w:r>
+        <w:lastRenderedPageBreak/>
         <w:t xml:space="preserve">-- Main.lua </w:t>
       </w:r>
     </w:p>
@@ -11725,7 +11726,11 @@
         <w:t>greeter</w:t>
       </w:r>
       <w:r>
-        <w:t xml:space="preserve"> prints </w:t>
+        <w:t xml:space="preserve"> </w:t>
+      </w:r>
+      <w:r>
+        <w:lastRenderedPageBreak/>
+        <w:t xml:space="preserve">prints </w:t>
       </w:r>
       <w:r>
         <w:t>“Hello World!”</w:t>
@@ -11831,7 +11836,6 @@
           <w:b/>
           <w:bCs/>
         </w:rPr>
-        <w:lastRenderedPageBreak/>
         <w:t>thread:yield()</w:t>
       </w:r>
     </w:p>
@@ -12099,6 +12103,7 @@
         <w:ind w:left="1440"/>
       </w:pPr>
       <w:r>
+        <w:lastRenderedPageBreak/>
         <w:t xml:space="preserve">while signal ~= </w:t>
       </w:r>
       <w:r>
@@ -12260,11 +12265,7 @@
         <w:t>OnEvent()</w:t>
       </w:r>
       <w:r>
-        <w:t xml:space="preserve"> </w:t>
-      </w:r>
-      <w:r>
-        <w:lastRenderedPageBreak/>
-        <w:t>service. When the CLEU</w:t>
+        <w:t xml:space="preserve"> service. When the CLEU</w:t>
       </w:r>
       <w:r>
         <w:rPr>
@@ -12457,6 +12458,7 @@
         <w:pStyle w:val="Code"/>
       </w:pPr>
       <w:r>
+        <w:lastRenderedPageBreak/>
         <w:t>function pub:publishLogEntry()</w:t>
       </w:r>
     </w:p>
@@ -12613,7 +12615,6 @@
         <w:pStyle w:val="Technical"/>
       </w:pPr>
       <w:r>
-        <w:lastRenderedPageBreak/>
         <w:t xml:space="preserve">The function </w:t>
       </w:r>
       <w:r>
@@ -12827,6 +12828,7 @@
         <w:ind w:firstLine="720"/>
       </w:pPr>
       <w:r>
+        <w:lastRenderedPageBreak/>
         <w:t xml:space="preserve">mf:postResult( result ) </w:t>
       </w:r>
     </w:p>
@@ -12909,7 +12911,6 @@
         <w:pStyle w:val="Code"/>
       </w:pPr>
       <w:r>
-        <w:lastRenderedPageBreak/>
         <w:t>-- of the Talon timer.</w:t>
       </w:r>
     </w:p>
@@ -13254,6 +13255,7 @@
         </w:numPr>
       </w:pPr>
       <w:r>
+        <w:lastRenderedPageBreak/>
         <w:t>Lead developer and architect for the disaster recovery facility</w:t>
       </w:r>
       <w:r>
@@ -13296,7 +13298,6 @@
         </w:numPr>
       </w:pPr>
       <w:r>
-        <w:lastRenderedPageBreak/>
         <w:t xml:space="preserve">Author of </w:t>
       </w:r>
       <w:r>

</xml_diff>